<commit_message>
Reframe manuscript as a null-result paper
Abstract, Results, Discussion, Conclusion, highlights, and the response
table now state that neither MVM nor AI was associated with IH, keeping
the joint finding and the power statement.

Co-Authored-By: Claude Opus 5.5 <noreply@anthropic.com>
Claude-Session: https://claude.ai/code/session_017cSSzHhwQMgJphnHdZ9H9w
</commit_message>
<xml_diff>
--- a/cpp-placentas/manuscript/Wong_Placenta_IH_manuscript.docx
+++ b/cpp-placentas/manuscript/Wong_Placenta_IH_manuscript.docx
@@ -531,7 +531,7 @@
           <w:sz w:val="24"/>
           <w:szCs w:val="24"/>
         </w:rPr>
-        <w:t xml:space="preserve">3,727 (main text), 249 (abstract)</w:t>
+        <w:t xml:space="preserve">3,735 (main text), 247 (abstract)</w:t>
       </w:r>
     </w:p>
     <w:p>
@@ -669,7 +669,7 @@
           <w:sz w:val="24"/>
           <w:szCs w:val="24"/>
         </w:rPr>
-        <w:t xml:space="preserve">MVM was present in 13,119 (29.0%) pregnancies and AI in 10,188 (22.5%). IH developed in 700 of 40,700 infants (1.7%). MVM (aRR 1.14, 95% CI 0.96, 1.35) and AI (aRR 1.14, 95% CI 0.96, 1.35) were each imprecisely associated with modestly higher IH risk, with weaker estimates for the MVM score (aRR 1.05, 95% CI 0.97, 1.15) and AI score (aRR 1.03, 95% CI 0.98, 1.08). Infants whose placentas showed both MVM and AI had higher IH risk than those with neither (aRR 1.37, 95% CI 1.05, 1.78).</w:t>
+        <w:t xml:space="preserve">MVM was present in 13,119 (29.0%) pregnancies and AI in 10,188 (22.5%). IH developed in 700 of 40,700 infants (1.7%). Neither MVM (aRR 1.14, 95% CI 0.96, 1.35) nor AI (aRR 1.14, 95% CI 0.96, 1.35) was associated with IH, nor were the MVM score (aRR 1.05, 95% CI 0.97, 1.15) or AI score (aRR 1.03, 95% CI 0.98, 1.08). Infants whose placentas showed both MVM and AI had higher IH risk than those with neither (aRR 1.37, 95% CI 1.05, 1.78).</w:t>
       </w:r>
     </w:p>
     <w:p>
@@ -692,7 +692,7 @@
           <w:sz w:val="24"/>
           <w:szCs w:val="24"/>
         </w:rPr>
-        <w:t xml:space="preserve">Placental MVM and AI showed modest, imprecise associations with IH, strongest when both co-occurred.</w:t>
+        <w:t xml:space="preserve">Neither placental MVM nor AI was associated with IH, although having both lesions was associated with higher risk.</w:t>
       </w:r>
     </w:p>
     <w:p>
@@ -759,7 +759,7 @@
           <w:sz w:val="24"/>
           <w:szCs w:val="24"/>
         </w:rPr>
-        <w:t xml:space="preserve">• MVM and AI alone showed modest, imprecise associations with infantile haemangioma</w:t>
+        <w:t xml:space="preserve">• Placental MVM and AI alone were not associated with infantile haemangioma</w:t>
       </w:r>
     </w:p>
     <w:p>
@@ -1235,7 +1235,7 @@
           <w:sz w:val="24"/>
           <w:szCs w:val="24"/>
         </w:rPr>
-        <w:t xml:space="preserve">IH occurred in 2.0% (225/11,324) of infants with MVM and 1.6% (475/29,376) of those without, and in 2.0% (181/8,880) of infants with AI and 1.6% (519/31,820) of those without (Table 2). In primary models, estimates for any MVM (RR 1.14, 95% CI 0.96, 1.35) and any AI (RR 1.14, 95% CI 0.96, 1.35) were modestly above the null but imprecise, as were those for the MVM score (per point, RR 1.05, 95% CI 0.97, 1.15) and AI score (per compartment, RR 1.03, 95% CI 0.98, 1.08). Without adjustment for study site, estimates were larger (MVM RR 1.25, 95% CI 1.07, 1.46, and AI RR 1.20, 95% CI 1.02, 1.42). Adjustment for the 11 covariates changed estimates little, and almost all of the difference between crude and primary estimates arose when study site was added (Supplementary Table S3). Mutual adjustment for MVM and AI did not change either estimate (Supplementary Table S4).</w:t>
+        <w:t xml:space="preserve">IH occurred in 2.0% (225/11,324) of infants with MVM and 1.6% (475/29,376) of those without, and in 2.0% (181/8,880) of infants with AI and 1.6% (519/31,820) of those without (Table 2). In primary models, neither any MVM (RR 1.14, 95% CI 0.96, 1.35) nor any AI (RR 1.14, 95% CI 0.96, 1.35) was associated with IH, nor were the MVM score (per point, RR 1.05, 95% CI 0.97, 1.15) or AI score (per compartment, RR 1.03, 95% CI 0.98, 1.08). Without adjustment for study site, estimates were larger (MVM RR 1.25, 95% CI 1.07, 1.46, and AI RR 1.20, 95% CI 1.02, 1.42). Adjustment for the 11 covariates changed estimates little, and almost all of the difference between crude and primary estimates arose when study site was added (Supplementary Table S3). Mutual adjustment for MVM and AI did not change either estimate (Supplementary Table S4).</w:t>
       </w:r>
     </w:p>
     <w:p>
@@ -1395,7 +1395,7 @@
           <w:sz w:val="24"/>
           <w:szCs w:val="24"/>
         </w:rPr>
-        <w:t xml:space="preserve">In this prospective cohort of 45,268 singleton pregnancies, placental MVM and AI were each associated with modestly higher IH risk after accounting for study site, but estimates were imprecise and compatible with both no association and a moderate increase in risk. There was no dose-response by MVM grade or AI stage. IH risk was highest when both MVM and AI were present, although the interaction estimate was imprecise. Much of the association observed without adjustment for site was explained by study site, which was more strongly associated with the recorded placental diagnoses than with IH.</w:t>
+        <w:t xml:space="preserve">In this prospective cohort of 45,268 singleton pregnancies, neither placental MVM nor AI was associated with IH after accounting for study site. Point estimates were slightly above the null, and the confidence intervals could not exclude either no association or a small increase in risk. There was no dose-response by MVM grade or AI stage. IH risk was highest when both MVM and AI were present, although the interaction estimate was imprecise. Much of the association observed without adjustment for site was explained by study site, which was more strongly associated with the recorded placental diagnoses than with IH.</w:t>
       </w:r>
     </w:p>
     <w:p>
@@ -1473,7 +1473,7 @@
           <w:sz w:val="24"/>
           <w:szCs w:val="24"/>
         </w:rPr>
-        <w:t xml:space="preserve">Earlier studies reported that placental anomalies were more common in pregnancies affected by IH [7,18]. These studies were small, used composite or selected exposures, and did not adjust for confounding, and the present estimates are considerably smaller. The findings are also consistent with a previous CPP analysis that found no clear association between hypertensive disorders of pregnancy and IH [36]. This may reflect that clinically defined hypertensive disorders are not consistently accompanied by MVM [37]. The findings also agree with evidence that the association between pre-eclampsia and IH in administrative data largely reflects greater surveillance of infants with longer neonatal stays [38]. Together, these studies suggest that any contribution of placental vascular injury to IH is likely to be modest.</w:t>
+        <w:t xml:space="preserve">Earlier studies reported that placental anomalies were more common in pregnancies affected by IH [7,18]. These studies were small, used composite or selected exposures, and did not adjust for confounding, and the present estimates are considerably smaller. The findings are also consistent with a previous CPP analysis that found no clear association between hypertensive disorders of pregnancy and IH [36]. This may reflect that clinically defined hypertensive disorders are not consistently accompanied by MVM [37]. The findings also agree with evidence that the association between pre-eclampsia and IH in administrative data largely reflects greater surveillance of infants with longer neonatal stays [38]. Together, these studies suggest that placental vascular injury is not a major determinant of IH, and that any contribution is likely to be small.</w:t>
       </w:r>
     </w:p>
     <w:p>
@@ -1505,7 +1505,7 @@
           <w:sz w:val="24"/>
           <w:szCs w:val="24"/>
         </w:rPr>
-        <w:t xml:space="preserve">The hypoxia hypothesis offers a plausible framework for a link between MVM and IH. IH shares markers and transcriptional programmes with placental tissue [9,10], and hypoxia-induced mediators of progenitor cell mobilisation are elevated in children with IH [11,14]. However, this evidence demonstrates a shared or hypoxia-responsive phenotype within established lesions rather than a causal effect of placental malperfusion, and genetic studies have not supported a maternal origin of IH cells [39]. A modest RR for MVM is therefore compatible with the hypothesis but does not confirm it. The absence of a gradient by MVM grade argues against a strong effect, although incomplete capture of MVM lesions and misclassification would attenuate a true gradient. One possibility, consistent with the predominantly postnatal growth of IH, is that antenatal placental injury expands a susceptible population of endothelial progenitor cells, whereas postnatal hormonal and angiogenic signals determine whether it proliferates [2,3]. This two-stage model has not been tested prospectively.</w:t>
+        <w:t xml:space="preserve">The hypoxia hypothesis offers a plausible framework for a link between MVM and IH. IH shares markers and transcriptional programmes with placental tissue [9,10], and hypoxia-induced mediators of progenitor cell mobilisation are elevated in children with IH [11,14]. However, this evidence demonstrates a shared or hypoxia-responsive phenotype within established lesions rather than a causal effect of placental malperfusion, and genetic studies have not supported a maternal origin of IH cells [39]. The null finding for MVM does not refute the hypothesis, because a small effect cannot be excluded, but it provides no support for a strong link. The absence of a gradient by MVM grade argues against a strong effect, although incomplete capture of MVM lesions and misclassification would attenuate a true gradient. One possibility, consistent with the predominantly postnatal growth of IH, is that antenatal placental injury expands a susceptible population of endothelial progenitor cells, whereas postnatal hormonal and angiogenic signals determine whether it proliferates [2,3]. This two-stage model has not been tested prospectively.</w:t>
       </w:r>
     </w:p>
     <w:p>
@@ -1579,7 +1579,7 @@
           <w:sz w:val="24"/>
           <w:szCs w:val="24"/>
         </w:rPr>
-        <w:t xml:space="preserve">Several limitations should be considered. First, despite the size of the cohort, IH is uncommon, and the study had limited power for the modest associations observed. Power to detect the observed RR of 1.14 was approximately 36% for MVM and 32% for AI, so small effects cannot be excluded. Second, the CPP predates the Amsterdam consensus, four lesions in the current MVM definition were not recorded [25], and both random and centre-specific exposure misclassification are likely. Third, IH was ascertained at a single examination at 12 months. Most IH reach their maximum size by five months of age and remain visible at one year [3], but small or involuting lesions may have been missed, and the diagnostic categories of the 1960s predate the modern classification of vascular anomalies. Outcome misclassification unrelated to placental pathology would most likely attenuate associations. Fourth, differences in IH ascertainment across centres may not be fully captured by adjustment for site. Fifth, residual confounding is possible, including by maternal history of angioma, an established risk factor that was not recorded [41]. Finally, gestational age and birthweight were not adjusted for because they may mediate effects of placental pathology [26], so estimates represent total effects.</w:t>
+        <w:t xml:space="preserve">Several limitations should be considered. First, despite the size of the cohort, IH is uncommon, and the study had limited power to detect small associations. Power to detect the observed RR of 1.14 was approximately 36% for MVM and 32% for AI, so small effects cannot be excluded. Second, the CPP predates the Amsterdam consensus, four lesions in the current MVM definition were not recorded [25], and both random and centre-specific exposure misclassification are likely. Third, IH was ascertained at a single examination at 12 months. Most IH reach their maximum size by five months of age and remain visible at one year [3], but small or involuting lesions may have been missed, and the diagnostic categories of the 1960s predate the modern classification of vascular anomalies. Outcome misclassification unrelated to placental pathology would most likely attenuate associations. Fourth, differences in IH ascertainment across centres may not be fully captured by adjustment for site. Fifth, residual confounding is possible, including by maternal history of angioma, an established risk factor that was not recorded [41]. Finally, gestational age and birthweight were not adjusted for because they may mediate effects of placental pathology [26], so estimates represent total effects.</w:t>
       </w:r>
     </w:p>
     <w:p>
@@ -1643,7 +1643,7 @@
           <w:sz w:val="24"/>
           <w:szCs w:val="24"/>
         </w:rPr>
-        <w:t xml:space="preserve">In this large prospective cohort, placental MVM and AI were each associated with modest, imprecisely estimated increases in IH risk after accounting for study site, with the highest risk when both were present. Variation in placental diagnosis across centres strongly influenced the estimates, underscoring the importance of accounting for centre and pathologist in multicentre placental research. Larger studies with centralised placental review are needed to determine whether combined placental injury contributes to IH.</w:t>
+        <w:t xml:space="preserve">In this large prospective cohort, neither placental MVM nor AI was associated with IH after accounting for study site, although IH risk was higher when both were present. Variation in placental diagnosis across centres strongly influenced the estimates, underscoring the importance of accounting for centre and pathologist in multicentre placental research. Larger studies with centralised placental review are needed to determine whether combined placental injury contributes to IH.</w:t>
       </w:r>
     </w:p>
     <w:p>

</xml_diff>

<commit_message>
Clarify exposure modelling in the statistical analysis
Co-Authored-By: Claude Opus 5.5 <noreply@anthropic.com>
Claude-Session: https://claude.ai/code/session_017cSSzHhwQMgJphnHdZ9H9w
</commit_message>
<xml_diff>
--- a/cpp-placentas/manuscript/Wong_Placenta_IH_manuscript.docx
+++ b/cpp-placentas/manuscript/Wong_Placenta_IH_manuscript.docx
@@ -531,7 +531,7 @@
           <w:sz w:val="24"/>
           <w:szCs w:val="24"/>
         </w:rPr>
-        <w:t xml:space="preserve">3,735 (main text), 247 (abstract)</w:t>
+        <w:t xml:space="preserve">3,791 (main text), 247 (abstract)</w:t>
       </w:r>
     </w:p>
     <w:p>
@@ -1111,7 +1111,7 @@
           <w:sz w:val="24"/>
           <w:szCs w:val="24"/>
         </w:rPr>
-        <w:t xml:space="preserve">Relative risks (RR) and 95% confidence intervals (CI) were estimated with modified Poisson regression [31] using generalised estimating equations with an exchangeable correlation structure, to account for siblings born to the same mother [32]. Three models were fitted for each exposure: crude, primary (11 covariates, study site, and weights), and secondary (11 covariates and weights, without study site). The main exposures were any MVM and any AI, with the MVM and AI scores also reported, and the joint exposure was included in the main results. Mutually adjusted models included MVM and AI together. For the joint exposure, additive interaction was quantified with the relative excess risk due to interaction (RERI), the attributable proportion, and the synergy index, and multiplicative interaction with the ratio of RRs, with CIs estimated by the delta method from the pooled variance-covariance matrix [33,34]. The strength of association of study site with MVM, AI, and IH was summarised with Cramér's V.</w:t>
+        <w:t xml:space="preserve">Relative risks (RR) and 95% confidence intervals (CI) were estimated with modified Poisson regression [31] using generalised estimating equations with an exchangeable correlation structure, to account for siblings born to the same mother [32]. Three models were fitted for each exposure: crude, primary (11 covariates, study site, and weights), and secondary (11 covariates and weights, without study site). The primary exposures were any MVM and any AI (present versus absent), each examined in a separate model. The MVM score (per point) and AI score (per involved compartment) were also examined as continuous exposures. MVM and AI were then examined together in two ways. First, the four-category joint exposure compared placentas with MVM only, AI only, or both against placentas with neither. Second, a mutually adjusted model included any MVM and any AI in the same model, to estimate the association of each lesion pattern while holding the other constant. For the joint exposure, additive interaction was quantified with the relative excess risk due to interaction (RERI), the attributable proportion, and the synergy index, and multiplicative interaction with the ratio of RRs, with CIs estimated by the delta method from the pooled variance-covariance matrix [33,34]. The strength of association of study site with MVM, AI, and IH was summarised with Cramér's V.</w:t>
       </w:r>
     </w:p>
     <w:p>

</xml_diff>

<commit_message>
Restructure exposure sentence with numbered exposures and joint analyses
Co-Authored-By: Claude Opus 5.5 <noreply@anthropic.com>
Claude-Session: https://claude.ai/code/session_017cSSzHhwQMgJphnHdZ9H9w
</commit_message>
<xml_diff>
--- a/cpp-placentas/manuscript/Wong_Placenta_IH_manuscript.docx
+++ b/cpp-placentas/manuscript/Wong_Placenta_IH_manuscript.docx
@@ -531,7 +531,7 @@
           <w:sz w:val="24"/>
           <w:szCs w:val="24"/>
         </w:rPr>
-        <w:t xml:space="preserve">3,791 (main text), 247 (abstract)</w:t>
+        <w:t xml:space="preserve">3,789 (main text), 247 (abstract)</w:t>
       </w:r>
     </w:p>
     <w:p>
@@ -1111,7 +1111,7 @@
           <w:sz w:val="24"/>
           <w:szCs w:val="24"/>
         </w:rPr>
-        <w:t xml:space="preserve">Relative risks (RR) and 95% confidence intervals (CI) were estimated with modified Poisson regression [31] using generalised estimating equations with an exchangeable correlation structure, to account for siblings born to the same mother [32]. Three models were fitted for each exposure: crude, primary (11 covariates, study site, and weights), and secondary (11 covariates and weights, without study site). The primary exposures were any MVM and any AI (present versus absent), each examined in a separate model. The MVM score (per point) and AI score (per involved compartment) were also examined as continuous exposures. MVM and AI were then examined together in two ways. First, the four-category joint exposure compared placentas with MVM only, AI only, or both against placentas with neither. Second, a mutually adjusted model included any MVM and any AI in the same model, to estimate the association of each lesion pattern while holding the other constant. For the joint exposure, additive interaction was quantified with the relative excess risk due to interaction (RERI), the attributable proportion, and the synergy index, and multiplicative interaction with the ratio of RRs, with CIs estimated by the delta method from the pooled variance-covariance matrix [33,34]. The strength of association of study site with MVM, AI, and IH was summarised with Cramér's V.</w:t>
+        <w:t xml:space="preserve">Relative risks (RR) and 95% confidence intervals (CI) were estimated with modified Poisson regression [31] using generalised estimating equations with an exchangeable correlation structure, to account for siblings born to the same mother [32]. Three models were fitted for each exposure: crude, primary (11 covariates, study site, and weights), and secondary (11 covariates and weights, without study site). The exposures, (1) MVM and (2) AI, were each examined in separate models, both as binary variables (present versus absent) and as continuous scores (MVM per point and AI per involved compartment). MVM and AI were also examined jointly using (1) a four-category joint exposure that compared placentas with MVM only, AI only, or both against placentas with neither, and (2) a mutually adjusted model that included any MVM and any AI in the same model, to estimate the association of each lesion pattern while holding the other constant. For the joint exposure, additive interaction was quantified with the relative excess risk due to interaction (RERI), the attributable proportion, and the synergy index, and multiplicative interaction with the ratio of RRs, with CIs estimated by the delta method from the pooled variance-covariance matrix [33,34]. The strength of association of study site with MVM, AI, and IH was summarised with Cramér's V.</w:t>
       </w:r>
     </w:p>
     <w:p>

</xml_diff>

<commit_message>
Rename to sensitivity analyses, move Cramer's V into the list, drop perinatal outcomes from Results
Co-Authored-By: Claude Opus 5.5 <noreply@anthropic.com>
Claude-Session: https://claude.ai/code/session_017cSSzHhwQMgJphnHdZ9H9w
</commit_message>
<xml_diff>
--- a/cpp-placentas/manuscript/Wong_Placenta_IH_manuscript.docx
+++ b/cpp-placentas/manuscript/Wong_Placenta_IH_manuscript.docx
@@ -531,7 +531,7 @@
           <w:sz w:val="24"/>
           <w:szCs w:val="24"/>
         </w:rPr>
-        <w:t xml:space="preserve">3,630 (main text), 247 (abstract)</w:t>
+        <w:t xml:space="preserve">3,588 (main text), 247 (abstract)</w:t>
       </w:r>
     </w:p>
     <w:p>
@@ -1111,7 +1111,7 @@
           <w:sz w:val="24"/>
           <w:szCs w:val="24"/>
         </w:rPr>
-        <w:t xml:space="preserve">Relative risks (RR) and 95% confidence intervals (CI) were estimated with modified Poisson regression [31] using generalised estimating equations with an exchangeable correlation structure, to account for siblings born to the same mother [32]. The exposures, (1) MVM and (2) AI, were each examined in separate models, both as binary variables (present versus absent) and as continuous scores (MVM per point and AI per involved compartment). MVM and AI were also examined jointly using (1) a four-category joint exposure that compared placentas with MVM only, AI only, or both against placentas with neither, and (2) a mutually adjusted model that included any MVM and any AI in the same model, to estimate the association of each lesion pattern while holding the other constant. Three models were fitted for each exposure: (1) crude, (2) primary (11 covariates, study site, and weights), and (3) secondary (11 covariates and weights, without study site). For the joint exposure, additive interaction was quantified with the relative excess risk due to interaction (RERI), the attributable proportion, and the synergy index, and multiplicative interaction with the ratio of RRs, with CIs estimated by the delta method from the pooled variance-covariance matrix [33,34]. The strength of association of study site with MVM, AI, and IH was summarised with Cramér's V.</w:t>
+        <w:t xml:space="preserve">Relative risks (RR) and 95% confidence intervals (CI) were estimated with modified Poisson regression [31] using generalised estimating equations with an exchangeable correlation structure, to account for siblings born to the same mother [32]. The exposures, (1) MVM and (2) AI, were each examined in separate models, both as binary variables (present versus absent) and as continuous scores (MVM per point and AI per involved compartment). MVM and AI were also examined jointly using (1) a four-category joint exposure that compared placentas with MVM only, AI only, or both against placentas with neither, and (2) a mutually adjusted model that included any MVM and any AI in the same model, to estimate the association of each lesion pattern while holding the other constant. Three models were fitted for each exposure: (1) crude, (2) primary (11 covariates, study site, and weights), and (3) secondary (11 covariates and weights, without study site). For the joint exposure, additive interaction was quantified with the relative excess risk due to interaction (RERI), the attributable proportion, and the synergy index, and multiplicative interaction with the ratio of RRs, with CIs estimated by the delta method from the pooled variance-covariance matrix [33,34].</w:t>
       </w:r>
     </w:p>
     <w:p>
@@ -1125,7 +1125,7 @@
           <w:sz w:val="24"/>
           <w:szCs w:val="24"/>
         </w:rPr>
-        <w:t xml:space="preserve">Secondary analyses examined (1) MVM grade and AI stage (i.e., none [reference], low, or high, to assess whether IH risk increased with lesion severity), (2) AI by maternal or foetal involvement (i.e., maternal response only [amnion or chorion], foetal response only [umbilical vessels or foetal surface vessels], or both, compared with no AI), (3) sequential addition of covariate groups and study site, and (4) study site as a random intercept instead of a fixed effect. Sensitivity analyses examined (5) stratification by the Boston centre, where 92.6% of placentas were examined by one pathologist [22], versus the other 11 centres, and (6) the broader outcome that included suspect IH.</w:t>
+        <w:t xml:space="preserve">Sensitivity analyses examined (1) MVM grade and AI stage (i.e., none [reference], low, or high, to assess whether IH risk increased with lesion severity), (2) AI by maternal or foetal involvement (i.e., maternal response only [amnion or chorion], foetal response only [umbilical vessels or foetal surface vessels], or both, compared with no AI), (3) the strength of association of study site with MVM, AI, and IH (Cramér's V), (4) sequential addition of covariate groups and study site, (5) study site as a random intercept instead of a fixed effect, (6) stratification by the Boston centre, where 92.6% of placentas were examined by one pathologist [22], versus the other 11 centres, and (7) the broader outcome that included suspect IH.</w:t>
       </w:r>
     </w:p>
     <w:p>
@@ -1189,7 +1189,7 @@
           <w:sz w:val="24"/>
           <w:szCs w:val="24"/>
         </w:rPr>
-        <w:t xml:space="preserve">Of 45,268 pregnancies, 29.0% (13,119) had any MVM, 22.5% (10,188) had any AI, and 7.9% (3,554) had both (Table 1). Pregnancies with MVM more often ended in preterm birth (19.9% vs 12.4%) and SGA (11.9% vs 7.4%), with lower mean birthweight (2,988 g vs 3,206 g). Pregnancies with AI more often involved White women (52.3% vs 47.0%) and heavy smoking (20.5% vs 16.6%), and more often ended in preterm birth (17.8% vs 13.7%). Among the 40,700 infants (89.9%) with an observed outcome, 1.7% (700) had definite IH and a further 0.6% (230) had suspect IH (Supplementary Table S1).</w:t>
+        <w:t xml:space="preserve">Of 45,268 pregnancies, 29.0% (13,119) had any MVM, 22.5% (10,188) had any AI, and 7.9% (3,554) had both (Table 1). Pregnancies with AI more often involved White women (52.3% vs 47.0%) and heavy smoking (20.5% vs 16.6%). Among the 40,700 infants (89.9%) with an observed outcome, 1.7% (700) had definite IH and a further 0.6% (230) had suspect IH (Supplementary Table S1).</w:t>
       </w:r>
     </w:p>
     <w:p>

</xml_diff>

<commit_message>
Remove Cramer's V and the power and software paragraph from Methods
Co-Authored-By: Claude Opus 5.5 <noreply@anthropic.com>
Claude-Session: https://claude.ai/code/session_017cSSzHhwQMgJphnHdZ9H9w
</commit_message>
<xml_diff>
--- a/cpp-placentas/manuscript/Wong_Placenta_IH_manuscript.docx
+++ b/cpp-placentas/manuscript/Wong_Placenta_IH_manuscript.docx
@@ -531,7 +531,7 @@
           <w:sz w:val="24"/>
           <w:szCs w:val="24"/>
         </w:rPr>
-        <w:t xml:space="preserve">3,588 (main text), 247 (abstract)</w:t>
+        <w:t xml:space="preserve">3,495 (main text), 247 (abstract)</w:t>
       </w:r>
     </w:p>
     <w:p>
@@ -1125,21 +1125,7 @@
           <w:sz w:val="24"/>
           <w:szCs w:val="24"/>
         </w:rPr>
-        <w:t xml:space="preserve">Sensitivity analyses examined (1) MVM grade and AI stage (i.e., none [reference], low, or high, to assess whether IH risk increased with lesion severity), (2) AI by maternal or foetal involvement (i.e., maternal response only [amnion or chorion], foetal response only [umbilical vessels or foetal surface vessels], or both, compared with no AI), (3) the strength of association of study site with MVM, AI, and IH (Cramér's V), (4) sequential addition of covariate groups and study site, (5) study site as a random intercept instead of a fixed effect, (6) stratification by the Boston centre, where 92.6% of placentas were examined by one pathologist [22], versus the other 11 centres, and (7) the broader outcome that included suspect IH.</w:t>
-      </w:r>
-    </w:p>
-    <w:p>
-      <w:pPr>
-        <w:spacing w:after="0" w:before="0" w:line="480"/>
-        <w:ind w:firstLine="480"/>
-      </w:pPr>
-      <w:r>
-        <w:rPr>
-          <w:rFonts w:ascii="Times New Roman" w:cs="Times New Roman" w:eastAsia="Times New Roman" w:hAnsi="Times New Roman"/>
-          <w:sz w:val="24"/>
-          <w:szCs w:val="24"/>
-        </w:rPr>
-        <w:t xml:space="preserve">With 700 cases, the study had 80% power (two-sided α = 0.05) to detect RRs of 1.25 for any MVM, 1.27 for any AI, and 1.47 for both lesions versus neither. Results are interpreted according to the magnitude and precision of estimates, and P values are not reported. Analyses used R version 4.3.3 with the geepack, mice, and lme4 packages.</w:t>
+        <w:t xml:space="preserve">Sensitivity analyses examined (1) MVM grade and AI stage (i.e., none [reference], low, or high, to assess whether IH risk increased with lesion severity), (2) AI by maternal or foetal involvement (i.e., maternal response only [amnion or chorion], foetal response only [umbilical vessels or foetal surface vessels], or both, compared with no AI), (3) sequential addition of covariate groups and study site, (4) study site as a random intercept instead of a fixed effect, (5) stratification by the Boston centre, where 92.6% of placentas were examined by one pathologist [22], versus the other 11 centres, and (6) the broader outcome that included suspect IH.</w:t>
       </w:r>
     </w:p>
     <w:p>
@@ -1203,7 +1189,7 @@
           <w:sz w:val="24"/>
           <w:szCs w:val="24"/>
         </w:rPr>
-        <w:t xml:space="preserve">Across centres, any MVM ranged from 9.8% to 80.3%, any AI from 14.5% to 38.1%, and definite IH from 0.4% to 3.6% (Supplementary Table S2). Boston contributed 41.4% (290/700) of IH cases. Study site was more strongly associated with MVM (Cramér's V 0.38) and AI (0.15) than with IH (0.09).</w:t>
+        <w:t xml:space="preserve">Across centres, any MVM ranged from 9.8% to 80.3%, any AI from 14.5% to 38.1%, and definite IH from 0.4% to 3.6% (Supplementary Table S2). Boston contributed 41.4% (290/700) of IH cases.</w:t>
       </w:r>
     </w:p>
     <w:p>

</xml_diff>

<commit_message>
Add MVM participant characteristics sentence to Results
Co-Authored-By: Claude Opus 5.5 <noreply@anthropic.com>
Claude-Session: https://claude.ai/code/session_017cSSzHhwQMgJphnHdZ9H9w
</commit_message>
<xml_diff>
--- a/cpp-placentas/manuscript/Wong_Placenta_IH_manuscript.docx
+++ b/cpp-placentas/manuscript/Wong_Placenta_IH_manuscript.docx
@@ -531,7 +531,7 @@
           <w:sz w:val="24"/>
           <w:szCs w:val="24"/>
         </w:rPr>
-        <w:t xml:space="preserve">3,495 (main text), 247 (abstract)</w:t>
+        <w:t xml:space="preserve">3,518 (main text), 247 (abstract)</w:t>
       </w:r>
     </w:p>
     <w:p>
@@ -1175,7 +1175,7 @@
           <w:sz w:val="24"/>
           <w:szCs w:val="24"/>
         </w:rPr>
-        <w:t xml:space="preserve">Of 45,268 pregnancies, 29.0% (13,119) had any MVM, 22.5% (10,188) had any AI, and 7.9% (3,554) had both (Table 1). Pregnancies with AI more often involved White women (52.3% vs 47.0%) and heavy smoking (20.5% vs 16.6%). Among the 40,700 infants (89.9%) with an observed outcome, 1.7% (700) had definite IH and a further 0.6% (230) had suspect IH (Supplementary Table S1).</w:t>
+        <w:t xml:space="preserve">Of 45,268 pregnancies, 29.0% (13,119) had any MVM, 22.5% (10,188) had any AI, and 7.9% (3,554) had both (Table 1). Pregnancies with MVM more often involved women with less than a high school education (19.7% vs 16.3%) and pre-pregnancy diabetes (2.1% vs 1.3%). Pregnancies with AI more often involved White women (52.3% vs 47.0%) and heavy smoking (20.5% vs 16.6%). Among the 40,700 infants (89.9%) with an observed outcome, 1.7% (700) had definite IH and a further 0.6% (230) had suspect IH (Supplementary Table S1).</w:t>
       </w:r>
     </w:p>
     <w:p>

</xml_diff>

<commit_message>
Rewrite MVM, AI, and IH results paragraph to follow Methods order
Co-Authored-By: Claude Opus 5.5 <noreply@anthropic.com>
Claude-Session: https://claude.ai/code/session_017cSSzHhwQMgJphnHdZ9H9w
</commit_message>
<xml_diff>
--- a/cpp-placentas/manuscript/Wong_Placenta_IH_manuscript.docx
+++ b/cpp-placentas/manuscript/Wong_Placenta_IH_manuscript.docx
@@ -531,7 +531,7 @@
           <w:sz w:val="24"/>
           <w:szCs w:val="24"/>
         </w:rPr>
-        <w:t xml:space="preserve">3,518 (main text), 247 (abstract)</w:t>
+        <w:t xml:space="preserve">3,534 (main text), 247 (abstract)</w:t>
       </w:r>
     </w:p>
     <w:p>
@@ -1221,7 +1221,7 @@
           <w:sz w:val="24"/>
           <w:szCs w:val="24"/>
         </w:rPr>
-        <w:t xml:space="preserve">IH occurred in 2.0% (225/11,324) of infants with MVM and 1.6% (475/29,376) of those without, and in 2.0% (181/8,880) of infants with AI and 1.6% (519/31,820) of those without (Table 2). In primary models, neither any MVM (RR 1.14, 95% CI 0.96, 1.35) nor any AI (RR 1.14, 95% CI 0.96, 1.35) was associated with IH, nor were the MVM score (per point, RR 1.05, 95% CI 0.97, 1.15) or AI score (per compartment, RR 1.03, 95% CI 0.98, 1.08). Without adjustment for study site, estimates were larger (MVM RR 1.25, 95% CI 1.07, 1.46, and AI RR 1.20, 95% CI 1.02, 1.42). Adjustment for the 11 covariates changed estimates little, and almost all of the difference between crude and primary estimates arose when study site was added (Supplementary Table S3). Mutual adjustment for MVM and AI did not change either estimate (Supplementary Table S4).</w:t>
+        <w:t xml:space="preserve">IH occurred in 2.0% (225/11,324) of infants with MVM and 1.6% (475/29,376) of those without, and in 2.0% (181/8,880) of infants with AI and 1.6% (519/31,820) of those without (Table 2). In the primary model, neither MVM (RR 1.14, 95% CI 0.96, 1.35) nor AI (RR 1.14, 95% CI 0.96, 1.35) was associated with IH, and neither was the MVM score (per point, RR 1.05, 95% CI 0.97, 1.15) or the AI score (per involved compartment, RR 1.03, 95% CI 0.98, 1.08). In the mutually adjusted model, estimates were unchanged (MVM RR 1.14, 95% CI 0.96, 1.35, and AI RR 1.13, 95% CI 0.96, 1.34) (Supplementary Table S4). In the secondary model without study site, estimates were larger (MVM RR 1.25, 95% CI 1.07, 1.46, and AI RR 1.20, 95% CI 1.02, 1.42).</w:t>
       </w:r>
     </w:p>
     <w:p>
@@ -1331,7 +1331,7 @@
           <w:sz w:val="24"/>
           <w:szCs w:val="24"/>
         </w:rPr>
-        <w:t xml:space="preserve">Results were similar when study site was modelled as a random effect (MVM RR 1.16, AI RR 1.15) and when suspect IH was included in the outcome (MVM RR 1.13, AI RR 1.10) (Supplementary Tables S9 and S10). Inverse probability weighting changed no estimate by more than 0.01.</w:t>
+        <w:t xml:space="preserve">Adjustment for the 11 covariates changed estimates little, and almost all of the difference between crude and primary estimates arose when study site was added (Supplementary Table S3). Results were similar when study site was modelled as a random effect (MVM RR 1.16, AI RR 1.15) and when suspect IH was included in the outcome (MVM RR 1.13, AI RR 1.10) (Supplementary Tables S9 and S10). Inverse probability weighting changed no estimate by more than 0.01.</w:t>
       </w:r>
     </w:p>
     <w:p>

</xml_diff>

<commit_message>
Rewrite Results: merge sensitivity analyses into 3.4 in Methods order
Co-Authored-By: Claude Opus 5.5 <noreply@anthropic.com>
Claude-Session: https://claude.ai/code/session_017cSSzHhwQMgJphnHdZ9H9w
</commit_message>
<xml_diff>
--- a/cpp-placentas/manuscript/Wong_Placenta_IH_manuscript.docx
+++ b/cpp-placentas/manuscript/Wong_Placenta_IH_manuscript.docx
@@ -531,7 +531,7 @@
           <w:sz w:val="24"/>
           <w:szCs w:val="24"/>
         </w:rPr>
-        <w:t xml:space="preserve">3,534 (main text), 247 (abstract)</w:t>
+        <w:t xml:space="preserve">3,586 (main text), 247 (abstract)</w:t>
       </w:r>
     </w:p>
     <w:p>
@@ -1175,7 +1175,7 @@
           <w:sz w:val="24"/>
           <w:szCs w:val="24"/>
         </w:rPr>
-        <w:t xml:space="preserve">Of 45,268 pregnancies, 29.0% (13,119) had any MVM, 22.5% (10,188) had any AI, and 7.9% (3,554) had both (Table 1). Pregnancies with MVM more often involved women with less than a high school education (19.7% vs 16.3%) and pre-pregnancy diabetes (2.1% vs 1.3%). Pregnancies with AI more often involved White women (52.3% vs 47.0%) and heavy smoking (20.5% vs 16.6%). Among the 40,700 infants (89.9%) with an observed outcome, 1.7% (700) had definite IH and a further 0.6% (230) had suspect IH (Supplementary Table S1).</w:t>
+        <w:t xml:space="preserve">Of 45,268 pregnancies, 29.0% (13,119) had any MVM, 22.5% (10,188) had any AI, and 7.9% (3,554) had both (Table 1). Pregnancies with MVM more often involved women with less than a high school education (19.7% vs 16.3%), pre-pregnancy diabetes (2.1% vs 1.3%), and chronic hypertension (6.3% vs 5.6%). Pregnancies with AI more often involved White women (52.3% vs 47.0%), heavy smoking (20.5% vs 16.6%), and male infants (53.4% vs 50.2%). Of the 40,700 infants (89.9%) examined at one year, 1.7% (700) had definite IH and a further 0.6% (230) had suspect IH (Supplementary Table S1).</w:t>
       </w:r>
     </w:p>
     <w:p>
@@ -1189,7 +1189,7 @@
           <w:sz w:val="24"/>
           <w:szCs w:val="24"/>
         </w:rPr>
-        <w:t xml:space="preserve">Across centres, any MVM ranged from 9.8% to 80.3%, any AI from 14.5% to 38.1%, and definite IH from 0.4% to 3.6% (Supplementary Table S2). Boston contributed 41.4% (290/700) of IH cases.</w:t>
+        <w:t xml:space="preserve">Across centres, any MVM ranged from 9.8% to 80.3%, any AI from 14.5% to 38.1%, and definite IH from 0.4% to 3.6%, with Boston contributing 41.4% (290/700) of IH cases (Supplementary Table S2).</w:t>
       </w:r>
     </w:p>
     <w:p>
@@ -1253,7 +1253,7 @@
           <w:sz w:val="24"/>
           <w:szCs w:val="24"/>
         </w:rPr>
-        <w:t xml:space="preserve">Compared with placentas that had neither pattern (IH 1.6%, 364/23,391), IH risk was similar for placentas with MVM only (1.8%, RR 1.08, 95% CI 0.89, 1.32) or AI only (1.9%, RR 1.07, 95% CI 0.86, 1.32), and higher for placentas with both (2.4%, 70/2,895, RR 1.37, 95% CI 1.05, 1.78) (Table 2). The RERI was 0.22 (95% CI −0.20, 0.64), the attributable proportion was 0.16 (95% CI −0.12, 0.44), and the ratio of RRs was 1.18 (95% CI 0.83, 1.68). These estimates were compatible with, but did not establish, interaction on either scale (Supplementary Table S5).</w:t>
+        <w:t xml:space="preserve">Compared with placentas that had neither MVM nor AI (IH 1.6%, 364/23,391), IH risk was similar for placentas with MVM only (1.8%, RR 1.08, 95% CI 0.89, 1.32) or AI only (1.9%, RR 1.07, 95% CI 0.86, 1.32), and higher for placentas with both (2.4%, 70/2,895, RR 1.37, 95% CI 1.05, 1.78) (Table 2). The RERI was 0.22 (95% CI −0.20, 0.64), the attributable proportion was 0.16 (95% CI −0.12, 0.44), and the ratio of RRs was 1.18 (95% CI 0.83, 1.68). These estimates were compatible with, but did not establish, interaction on either scale (Supplementary Table S5).</w:t>
       </w:r>
     </w:p>
     <w:p>
@@ -1271,7 +1271,7 @@
           <w:sz w:val="24"/>
           <w:szCs w:val="24"/>
         </w:rPr>
-        <w:t xml:space="preserve">3.4. Grade, stage, and location of placental lesions</w:t>
+        <w:t xml:space="preserve">3.4. Sensitivity analyses</w:t>
       </w:r>
     </w:p>
     <w:p>
@@ -1285,25 +1285,7 @@
           <w:sz w:val="24"/>
           <w:szCs w:val="24"/>
         </w:rPr>
-        <w:t xml:space="preserve">No dose-response was observed. Compared with no MVM, the RR was 1.15 (95% CI 0.96, 1.37) for low-grade and 1.09 (95% CI 0.77, 1.55) for high-grade MVM. For AI, the RR was 1.26 (95% CI 1.02, 1.55) for low stage and 1.00 (95% CI 0.78, 1.28) for high stage (Supplementary Table S6). By location, RRs were 1.07 (95% CI 0.81, 1.43) for maternal-only, 1.12 (95% CI 0.86, 1.47) for foetal-only, and 1.20 (95% CI 0.94, 1.55) for combined maternal and foetal inflammation (Supplementary Table S7). Foetal-only inflammation, which involved the umbilical vein in 87.8% of cases, had the largest crude estimate (RR 1.67, 95% CI 1.29, 2.18), which fell to 1.12 after adjustment for study site. Among infants with an observed outcome, 61.1% (1,359/2,224) of placentas with foetal-only inflammation were from Boston, where this pattern was recorded in 14.1% of placentas compared with 0.9% to 8.1% at the other centres.</w:t>
-      </w:r>
-    </w:p>
-    <w:p>
-      <w:pPr>
-        <w:keepNext/>
-        <w:spacing w:after="0" w:before="240" w:line="480"/>
-      </w:pPr>
-      <w:r>
-        <w:rPr>
-          <w:rFonts w:ascii="Times New Roman" w:cs="Times New Roman" w:eastAsia="Times New Roman" w:hAnsi="Times New Roman"/>
-          <w:b/>
-          <w:bCs/>
-          <w:i/>
-          <w:iCs/>
-          <w:sz w:val="24"/>
-          <w:szCs w:val="24"/>
-        </w:rPr>
-        <w:t xml:space="preserve">3.5. Study site and sensitivity analyses</w:t>
+        <w:t xml:space="preserve">IH risk did not increase with lesion severity. Compared with no MVM, the RR was 1.15 (95% CI 0.96, 1.37) for low-grade and 1.09 (95% CI 0.77, 1.55) for high-grade MVM. Compared with no AI, the RR was 1.26 (95% CI 1.02, 1.55) for low-stage and 1.00 (95% CI 0.78, 1.28) for high-stage AI (Supplementary Table S6). By maternal or foetal involvement, RRs were 1.07 (95% CI 0.81, 1.43) for a maternal response only, 1.12 (95% CI 0.86, 1.47) for a foetal response only, and 1.20 (95% CI 0.94, 1.55) for both (Supplementary Table S7).</w:t>
       </w:r>
     </w:p>
     <w:p>
@@ -1317,7 +1299,7 @@
           <w:sz w:val="24"/>
           <w:szCs w:val="24"/>
         </w:rPr>
-        <w:t xml:space="preserve">In Boston, the RR was 1.11 (95% CI 0.87, 1.42) for MVM and 1.28 (95% CI 1.00, 1.63) for AI, compared with 1.14 (95% CI 0.90, 1.44) and 1.03 (95% CI 0.82, 1.31) at the other 11 centres (Supplementary Table S8). AI was recorded more often in Boston than elsewhere (27.6% vs 20.9%), whereas MVM prevalence was similar (29.8% vs 28.7%).</w:t>
+        <w:t xml:space="preserve">Adjustment for the 11 covariates changed estimates little, and almost all of the difference between crude and primary estimates arose when study site was added (Supplementary Table S3). Results were similar when study site was modelled as a random effect (MVM RR 1.16, 95% CI 0.98, 1.37, and AI RR 1.15, 95% CI 0.97, 1.36) (Supplementary Table S9). In Boston, the RR was 1.11 (95% CI 0.87, 1.42) for MVM and 1.28 (95% CI 1.00, 1.63) for AI, compared with 1.14 (95% CI 0.90, 1.44) and 1.03 (95% CI 0.82, 1.31) at the other 11 centres (Supplementary Table S8). AI was recorded more often in Boston than elsewhere (27.6% vs 20.9%), whereas MVM prevalence was similar (29.8% vs 28.7%). Foetal-only inflammation, which involved the umbilical vein in 87.8% of cases, had the largest crude estimate of any AI category (RR 1.67, 95% CI 1.29, 2.18), which fell to 1.12 after adjustment for study site. Of the 2,224 placentas with foetal-only inflammation among infants examined at one year, 61.1% (1,359) were from Boston, where this pattern was recorded in 14.1% of placentas compared with 0.9% to 8.1% at the other centres.</w:t>
       </w:r>
     </w:p>
     <w:p>
@@ -1331,7 +1313,7 @@
           <w:sz w:val="24"/>
           <w:szCs w:val="24"/>
         </w:rPr>
-        <w:t xml:space="preserve">Adjustment for the 11 covariates changed estimates little, and almost all of the difference between crude and primary estimates arose when study site was added (Supplementary Table S3). Results were similar when study site was modelled as a random effect (MVM RR 1.16, AI RR 1.15) and when suspect IH was included in the outcome (MVM RR 1.13, AI RR 1.10) (Supplementary Tables S9 and S10). Inverse probability weighting changed no estimate by more than 0.01.</w:t>
+        <w:t xml:space="preserve">When suspect IH was included in the outcome (930 cases), estimates were similar (MVM RR 1.13, 95% CI 0.98, 1.30, and AI RR 1.10, 95% CI 0.95, 1.27) (Supplementary Table S10). Inverse probability weighting changed no estimate by more than 0.01.</w:t>
       </w:r>
     </w:p>
     <w:p>

</xml_diff>

<commit_message>
Revise Discussion for null framing and removed analyses
Co-Authored-By: Claude Opus 5.5 <noreply@anthropic.com>
Claude-Session: https://claude.ai/code/session_017cSSzHhwQMgJphnHdZ9H9w
</commit_message>
<xml_diff>
--- a/cpp-placentas/manuscript/Wong_Placenta_IH_manuscript.docx
+++ b/cpp-placentas/manuscript/Wong_Placenta_IH_manuscript.docx
@@ -531,7 +531,7 @@
           <w:sz w:val="24"/>
           <w:szCs w:val="24"/>
         </w:rPr>
-        <w:t xml:space="preserve">3,586 (main text), 247 (abstract)</w:t>
+        <w:t xml:space="preserve">3,623 (main text), 247 (abstract)</w:t>
       </w:r>
     </w:p>
     <w:p>
@@ -1363,7 +1363,7 @@
           <w:sz w:val="24"/>
           <w:szCs w:val="24"/>
         </w:rPr>
-        <w:t xml:space="preserve">In this prospective cohort of 45,268 singleton pregnancies, neither placental MVM nor AI was associated with IH after accounting for study site. Point estimates were slightly above the null, and the confidence intervals could not exclude either no association or a small increase in risk. There was no dose-response by MVM grade or AI stage. IH risk was highest when both MVM and AI were present, although the interaction estimate was imprecise. Much of the association observed without adjustment for site was explained by study site, which was more strongly associated with the recorded placental diagnoses than with IH.</w:t>
+        <w:t xml:space="preserve">In this prospective cohort of 45,268 singleton pregnancies, neither placental MVM nor AI was associated with IH after accounting for study site. Point estimates were slightly above the null, and the confidence intervals could not exclude a small increase in risk, but they make RRs larger than about 1.35 unlikely for either lesion pattern. IH risk did not increase with MVM grade or AI stage. IH risk was higher when both MVM and AI were present, although the interaction estimate was imprecise. The larger estimates observed without adjustment for study site reflected differences between centres rather than associations within centres.</w:t>
       </w:r>
     </w:p>
     <w:p>
@@ -1395,7 +1395,7 @@
           <w:sz w:val="24"/>
           <w:szCs w:val="24"/>
         </w:rPr>
-        <w:t xml:space="preserve">Variation in placental diagnosis across centres is central to interpreting these findings. MVM was recorded in 9.8% of placentas at one CPP centre and 80.3% at another, a range too wide to reflect differences in the populations alone. This is consistent with evidence that agreement between pathologists is only slight to fair for MVM, even when Amsterdam criteria are applied [21], and that agreement for AI, although high for its presence, is lower for staging [20]. Because IH prevalence also varied across centres, possibly reflecting differences in populations and in paediatric ascertainment, centre-level differences in diagnostic thresholds can confound the association between a recorded placental lesion and IH. Adjustment for study site compares placentas read within the same centre, and the resulting attenuation (MVM from 1.25 to 1.14, AI from 1.20 to 1.14) is consistent with removal of between-centre confounding. Estimates were similar when site was modelled as a random effect.</w:t>
+        <w:t xml:space="preserve">Variation in placental diagnosis across centres is central to interpreting these findings, because the association between placental pathology and IH was present only when centres were compared with one another. MVM was recorded in 9.8% of placentas at one CPP centre and 80.3% at another, a range too wide to reflect differences in the populations alone. This is consistent with evidence that agreement between pathologists is only slight to fair for MVM, even when Amsterdam criteria are applied [21], and that agreement for AI, although high for its presence, is lower for staging [20]. Because IH prevalence also varied across centres, possibly reflecting differences in populations and in paediatric ascertainment, centre-level differences in diagnostic thresholds can confound the association between a recorded placental lesion and IH. Adjustment for study site compares placentas read within the same centre, and the resulting attenuation (MVM from 1.25 to 1.14, AI from 1.20 to 1.14) is consistent with removal of between-centre confounding. Estimates were similar when site was modelled as a random effect.</w:t>
       </w:r>
     </w:p>
     <w:p>
@@ -1579,7 +1579,7 @@
           <w:sz w:val="24"/>
           <w:szCs w:val="24"/>
         </w:rPr>
-        <w:t xml:space="preserve">Future studies should examine placental pathology with central, blinded review using current Amsterdam definitions, duplicate reading of a calibration subset, and recorded pathologist identity. Linking placental lesions to cord-blood markers of foetal inflammation and hypoxia, and to serial dermatological examinations during the first months of life, would distinguish maternal from foetal effects and capture both the occurrence and growth of IH. Prespecified analyses of MVM and AI interaction, and formal mediation analyses through preterm birth and foetal growth, would clarify whether combined placental injury contributes to IH. Modifiable upstream determinants of placental injury, such as maternal diet, environmental exposures, and hypertensive disorders, are a research priority, although evidence linking these exposures to IH through placental pathology is currently lacking.</w:t>
+        <w:t xml:space="preserve">Future studies should examine placental pathology with central, blinded review using current Amsterdam definitions, duplicate reading of a calibration subset, and recorded pathologist identity. Linking placental lesions to cord-blood markers of foetal inflammation and hypoxia, and to serial dermatological examinations during the first months of life, would distinguish maternal from foetal effects and capture both the occurrence and growth of IH. Prespecified analyses of MVM and AI interaction, and formal mediation analyses through preterm birth and foetal growth, would clarify whether combined placental injury contributes to IH. Whether IH is associated with perinatal infection, which often underlies acute placental inflammation, also warrants study. Modifiable upstream determinants of placental injury, such as maternal diet, environmental exposures, and hypertensive disorders, are a research priority, although evidence linking these exposures to IH through placental pathology is currently lacking.</w:t>
       </w:r>
     </w:p>
     <w:p>
@@ -1611,7 +1611,7 @@
           <w:sz w:val="24"/>
           <w:szCs w:val="24"/>
         </w:rPr>
-        <w:t xml:space="preserve">In this large prospective cohort, neither placental MVM nor AI was associated with IH after accounting for study site, although IH risk was higher when both were present. Variation in placental diagnosis across centres strongly influenced the estimates, underscoring the importance of accounting for centre and pathologist in multicentre placental research. Larger studies with centralised placental review are needed to determine whether combined placental injury contributes to IH.</w:t>
+        <w:t xml:space="preserve">In this large prospective cohort, neither placental MVM nor AI was associated with IH after accounting for study site, although IH risk was higher when both were present. Variation in placental diagnosis across centres strongly influenced the estimates, underscoring the importance of accounting for centre and, where possible, pathologist in multicentre placental research. Larger studies with centralised placental review are needed to determine whether combined placental injury contributes to IH.</w:t>
       </w:r>
     </w:p>
     <w:p>

</xml_diff>

<commit_message>
Soften site interpretation sentence in Discussion
Co-Authored-By: Claude Opus 5.5 <noreply@anthropic.com>
Claude-Session: https://claude.ai/code/session_017cSSzHhwQMgJphnHdZ9H9w
</commit_message>
<xml_diff>
--- a/cpp-placentas/manuscript/Wong_Placenta_IH_manuscript.docx
+++ b/cpp-placentas/manuscript/Wong_Placenta_IH_manuscript.docx
@@ -531,7 +531,7 @@
           <w:sz w:val="24"/>
           <w:szCs w:val="24"/>
         </w:rPr>
-        <w:t xml:space="preserve">3,623 (main text), 247 (abstract)</w:t>
+        <w:t xml:space="preserve">3,620 (main text), 247 (abstract)</w:t>
       </w:r>
     </w:p>
     <w:p>
@@ -1395,7 +1395,7 @@
           <w:sz w:val="24"/>
           <w:szCs w:val="24"/>
         </w:rPr>
-        <w:t xml:space="preserve">Variation in placental diagnosis across centres is central to interpreting these findings, because the association between placental pathology and IH was present only when centres were compared with one another. MVM was recorded in 9.8% of placentas at one CPP centre and 80.3% at another, a range too wide to reflect differences in the populations alone. This is consistent with evidence that agreement between pathologists is only slight to fair for MVM, even when Amsterdam criteria are applied [21], and that agreement for AI, although high for its presence, is lower for staging [20]. Because IH prevalence also varied across centres, possibly reflecting differences in populations and in paediatric ascertainment, centre-level differences in diagnostic thresholds can confound the association between a recorded placental lesion and IH. Adjustment for study site compares placentas read within the same centre, and the resulting attenuation (MVM from 1.25 to 1.14, AI from 1.20 to 1.14) is consistent with removal of between-centre confounding. Estimates were similar when site was modelled as a random effect.</w:t>
+        <w:t xml:space="preserve">Variation in placental diagnosis across centres is central to interpreting these findings, because the associations seen without adjustment for study site arose largely from comparisons between centres. MVM was recorded in 9.8% of placentas at one CPP centre and 80.3% at another, a range too wide to reflect differences in the populations alone. This is consistent with evidence that agreement between pathologists is only slight to fair for MVM, even when Amsterdam criteria are applied [21], and that agreement for AI, although high for its presence, is lower for staging [20]. Because IH prevalence also varied across centres, possibly reflecting differences in populations and in paediatric ascertainment, centre-level differences in diagnostic thresholds can confound the association between a recorded placental lesion and IH. Adjustment for study site compares placentas read within the same centre, and the resulting attenuation (MVM from 1.25 to 1.14, AI from 1.20 to 1.14) is consistent with removal of between-centre confounding. Estimates were similar when site was modelled as a random effect.</w:t>
       </w:r>
     </w:p>
     <w:p>

</xml_diff>

<commit_message>
Shorten Boston discussion and cite Redline 2022 for interobserver reliability
Co-Authored-By: Claude Opus 5.5 <noreply@anthropic.com>
Claude-Session: https://claude.ai/code/session_017cSSzHhwQMgJphnHdZ9H9w
</commit_message>
<xml_diff>
--- a/cpp-placentas/manuscript/Wong_Placenta_IH_manuscript.docx
+++ b/cpp-placentas/manuscript/Wong_Placenta_IH_manuscript.docx
@@ -531,7 +531,7 @@
           <w:sz w:val="24"/>
           <w:szCs w:val="24"/>
         </w:rPr>
-        <w:t xml:space="preserve">3,620 (main text), 247 (abstract)</w:t>
+        <w:t xml:space="preserve">3,559 (main text), 247 (abstract)</w:t>
       </w:r>
     </w:p>
     <w:p>
@@ -554,7 +554,7 @@
           <w:sz w:val="24"/>
           <w:szCs w:val="24"/>
         </w:rPr>
-        <w:t xml:space="preserve">2. Figures: 1. Supplementary material: 1 file (Tables S1 to S10). References: 41</w:t>
+        <w:t xml:space="preserve">2. Figures: 1. Supplementary material: 1 file (Tables S1 to S10). References: 42</w:t>
       </w:r>
     </w:p>
     <w:p>
@@ -1395,7 +1395,7 @@
           <w:sz w:val="24"/>
           <w:szCs w:val="24"/>
         </w:rPr>
-        <w:t xml:space="preserve">Variation in placental diagnosis across centres is central to interpreting these findings, because the associations seen without adjustment for study site arose largely from comparisons between centres. MVM was recorded in 9.8% of placentas at one CPP centre and 80.3% at another, a range too wide to reflect differences in the populations alone. This is consistent with evidence that agreement between pathologists is only slight to fair for MVM, even when Amsterdam criteria are applied [21], and that agreement for AI, although high for its presence, is lower for staging [20]. Because IH prevalence also varied across centres, possibly reflecting differences in populations and in paediatric ascertainment, centre-level differences in diagnostic thresholds can confound the association between a recorded placental lesion and IH. Adjustment for study site compares placentas read within the same centre, and the resulting attenuation (MVM from 1.25 to 1.14, AI from 1.20 to 1.14) is consistent with removal of between-centre confounding. Estimates were similar when site was modelled as a random effect.</w:t>
+        <w:t xml:space="preserve">Variation in placental diagnosis across centres is central to interpreting these findings, because the associations seen without adjustment for study site arose largely from comparisons between centres. MVM was recorded in 9.8% of placentas at one CPP centre and 80.3% at another, a range too wide to reflect differences in the populations alone. This is consistent with evidence that agreement between pathologists is only slight to fair for MVM, even when Amsterdam criteria are applied [21,35], and that agreement for AI, although high for its presence, is lower for staging [20,35]. Because IH prevalence also varied across centres, possibly reflecting differences in populations and in paediatric ascertainment, centre-level differences in diagnostic thresholds can confound the association between a recorded placental lesion and IH. Adjustment for study site compares placentas read within the same centre, and the resulting attenuation (MVM from 1.25 to 1.14, AI from 1.20 to 1.14) is consistent with removal of between-centre confounding. Estimates were similar when site was modelled as a random effect.</w:t>
       </w:r>
     </w:p>
     <w:p>
@@ -1409,7 +1409,7 @@
           <w:sz w:val="24"/>
           <w:szCs w:val="24"/>
         </w:rPr>
-        <w:t xml:space="preserve">The Boston centre illustrates how reader practice can shape an exposure. Earlier CPP analyses restricted placental analyses to Boston, where one pathologist examined 92.6% of placentas, to maximise consistency [22]. In the present study, AI was recorded more often in Boston than at other centres, and foetal inflammation without a maternal response, usually limited to the umbilical vein, was recorded far more often. Because a foetal inflammatory response ordinarily follows a maternal response [20,35], this pattern suggests a lower diagnostic threshold rather than a different population. Consistency within a single reader therefore does not ensure comparability with other readers, and the stronger association between AI and IH in Boston should be interpreted with caution. Multicentre placental studies should account for centre and, where possible, reader, and would benefit from central review with calibration across pathologists.</w:t>
+        <w:t xml:space="preserve">The Boston centre, where one pathologist examined 92.6% of placentas [22], recorded AI more often than other centres, including foetal inflammation without a maternal response, a pattern that should be uncommon because a foetal response ordinarily follows a maternal one [20,36]. This suggests a lower diagnostic threshold, and shows that consistency within a single reader does not ensure comparability with other readers. Multicentre placental studies should therefore account for centre and, where possible, reader.</w:t>
       </w:r>
     </w:p>
     <w:p>
@@ -1441,7 +1441,7 @@
           <w:sz w:val="24"/>
           <w:szCs w:val="24"/>
         </w:rPr>
-        <w:t xml:space="preserve">Earlier studies reported that placental anomalies were more common in pregnancies affected by IH [7,18]. These studies were small, used composite or selected exposures, and did not adjust for confounding, and the present estimates are considerably smaller. The findings are also consistent with a previous CPP analysis that found no clear association between hypertensive disorders of pregnancy and IH [36]. This may reflect that clinically defined hypertensive disorders are not consistently accompanied by MVM [37]. The findings also agree with evidence that the association between pre-eclampsia and IH in administrative data largely reflects greater surveillance of infants with longer neonatal stays [38]. Together, these studies suggest that placental vascular injury is not a major determinant of IH, and that any contribution is likely to be small.</w:t>
+        <w:t xml:space="preserve">Earlier studies reported that placental anomalies were more common in pregnancies affected by IH [7,18]. These studies were small, used composite or selected exposures, and did not adjust for confounding, and the present estimates are considerably smaller. The findings are also consistent with a previous CPP analysis that found no clear association between hypertensive disorders of pregnancy and IH [37]. This may reflect that clinically defined hypertensive disorders are not consistently accompanied by MVM [38]. The findings also agree with evidence that the association between pre-eclampsia and IH in administrative data largely reflects greater surveillance of infants with longer neonatal stays [39]. Together, these studies suggest that placental vascular injury is not a major determinant of IH, and that any contribution is likely to be small.</w:t>
       </w:r>
     </w:p>
     <w:p>
@@ -1473,7 +1473,7 @@
           <w:sz w:val="24"/>
           <w:szCs w:val="24"/>
         </w:rPr>
-        <w:t xml:space="preserve">The hypoxia hypothesis offers a plausible framework for a link between MVM and IH. IH shares markers and transcriptional programmes with placental tissue [9,10], and hypoxia-induced mediators of progenitor cell mobilisation are elevated in children with IH [11,14]. However, this evidence demonstrates a shared or hypoxia-responsive phenotype within established lesions rather than a causal effect of placental malperfusion, and genetic studies have not supported a maternal origin of IH cells [39]. The null finding for MVM does not refute the hypothesis, because a small effect cannot be excluded, but it provides no support for a strong link. The absence of a gradient by MVM grade argues against a strong effect, although incomplete capture of MVM lesions and misclassification would attenuate a true gradient. One possibility, consistent with the predominantly postnatal growth of IH, is that antenatal placental injury expands a susceptible population of endothelial progenitor cells, whereas postnatal hormonal and angiogenic signals determine whether it proliferates [2,3]. This two-stage model has not been tested prospectively.</w:t>
+        <w:t xml:space="preserve">The hypoxia hypothesis offers a plausible framework for a link between MVM and IH. IH shares markers and transcriptional programmes with placental tissue [9,10], and hypoxia-induced mediators of progenitor cell mobilisation are elevated in children with IH [11,14]. However, this evidence demonstrates a shared or hypoxia-responsive phenotype within established lesions rather than a causal effect of placental malperfusion, and genetic studies have not supported a maternal origin of IH cells [40]. The null finding for MVM does not refute the hypothesis, because a small effect cannot be excluded, but it provides no support for a strong link. The absence of a gradient by MVM grade argues against a strong effect, although incomplete capture of MVM lesions and misclassification would attenuate a true gradient. One possibility, consistent with the predominantly postnatal growth of IH, is that antenatal placental injury expands a susceptible population of endothelial progenitor cells, whereas postnatal hormonal and angiogenic signals determine whether it proliferates [2,3]. This two-stage model has not been tested prospectively.</w:t>
       </w:r>
     </w:p>
     <w:p>
@@ -1487,7 +1487,7 @@
           <w:sz w:val="24"/>
           <w:szCs w:val="24"/>
         </w:rPr>
-        <w:t xml:space="preserve">AI is a less plausible cause of IH. Histological AI generally reflects an inflammatory process close to delivery, often of infectious origin, and a direct effect on localised skin angiogenesis would require a systemic foetal inflammatory response with lasting consequences [17,35]. The higher estimate for low-stage than high-stage AI, the absence of a clear gradient from maternal to foetal involvement, and the centre-specific pattern of foetal-only inflammation all argue against a causal interpretation. For retinopathy of prematurity, another postnatal disorder of angiogenesis, the association with chorioamnionitis is largely explained by lower gestational age [40], and AI may similarly mark pathways to preterm birth rather than act on IH directly.</w:t>
+        <w:t xml:space="preserve">AI is a less plausible cause of IH. Histological AI generally reflects an inflammatory process close to delivery, often of infectious origin, and a direct effect on localised skin angiogenesis would require a systemic foetal inflammatory response with lasting consequences [17,36]. The higher estimate for low-stage than high-stage AI, the absence of a clear gradient from maternal to foetal involvement, and the centre-specific pattern of foetal-only inflammation all argue against a causal interpretation. For retinopathy of prematurity, another postnatal disorder of angiogenesis, the association with chorioamnionitis is largely explained by lower gestational age [41], and AI may similarly mark pathways to preterm birth rather than act on IH directly.</w:t>
       </w:r>
     </w:p>
     <w:p>
@@ -1547,7 +1547,7 @@
           <w:sz w:val="24"/>
           <w:szCs w:val="24"/>
         </w:rPr>
-        <w:t xml:space="preserve">Several limitations should be considered. First, despite the size of the cohort, IH is uncommon, and the study had limited power to detect small associations. Power to detect the observed RR of 1.14 was approximately 36% for MVM and 32% for AI, so small effects cannot be excluded. Second, the CPP predates the Amsterdam consensus, four lesions in the current MVM definition were not recorded [25], and both random and centre-specific exposure misclassification are likely. Third, IH was ascertained at a single examination at 12 months. Most IH reach their maximum size by five months of age and remain visible at one year [3], but small or involuting lesions may have been missed, and the diagnostic categories of the 1960s predate the modern classification of vascular anomalies. Outcome misclassification unrelated to placental pathology would most likely attenuate associations. Fourth, differences in IH ascertainment across centres may not be fully captured by adjustment for site. Fifth, residual confounding is possible, including by maternal history of angioma, an established risk factor that was not recorded [41]. Finally, gestational age and birthweight were not adjusted for because they may mediate effects of placental pathology [26], so estimates represent total effects.</w:t>
+        <w:t xml:space="preserve">Several limitations should be considered. First, despite the size of the cohort, IH is uncommon, and the study had limited power to detect small associations. Power to detect the observed RR of 1.14 was approximately 36% for MVM and 32% for AI, so small effects cannot be excluded. Second, the CPP predates the Amsterdam consensus, four lesions in the current MVM definition were not recorded [25], and both random and centre-specific exposure misclassification are likely. Third, IH was ascertained at a single examination at 12 months. Most IH reach their maximum size by five months of age and remain visible at one year [3], but small or involuting lesions may have been missed, and the diagnostic categories of the 1960s predate the modern classification of vascular anomalies. Outcome misclassification unrelated to placental pathology would most likely attenuate associations. Fourth, differences in IH ascertainment across centres may not be fully captured by adjustment for site. Fifth, residual confounding is possible, including by maternal history of angioma, an established risk factor that was not recorded [42]. Finally, gestational age and birthweight were not adjusted for because they may mediate effects of placental pathology [26], so estimates represent total effects.</w:t>
       </w:r>
     </w:p>
     <w:p>
@@ -2305,7 +2305,7 @@
           <w:sz w:val="24"/>
           <w:szCs w:val="24"/>
         </w:rPr>
-        <w:t xml:space="preserve">[35] F. Gotsch, R. Romero, J.P. Kusanovic, et al., The fetal inflammatory response syndrome, Clin. Obstet. Gynecol. 50 (2007) 652-683. https://doi.org/10.1097/GRF.0b013e31811ebef6</w:t>
+        <w:t xml:space="preserve">[35] R.W. Redline, T. Vik, A. Heerema-McKenney, et al., Interobserver reliability for identifying specific patterns of placental injury as defined by the Amsterdam classification, Arch. Pathol. Lab. Med. 146 (2022) 372-378. https://doi.org/10.5858/arpa.2020-0753-OA</w:t>
       </w:r>
     </w:p>
     <w:p>
@@ -2319,7 +2319,7 @@
           <w:sz w:val="24"/>
           <w:szCs w:val="24"/>
         </w:rPr>
-        <w:t xml:space="preserve">[36] J.J. Wong, Y. Chakraborti, E.C. Caniglia, et al., Association between hypertensive disorders of pregnancy and infantile vascular anomalies in the Collaborative Perinatal Project, AJE Adv. 2 (2026) uuag016. https://doi.org/10.1093/ajeadv/uuag016</w:t>
+        <w:t xml:space="preserve">[36] F. Gotsch, R. Romero, J.P. Kusanovic, et al., The fetal inflammatory response syndrome, Clin. Obstet. Gynecol. 50 (2007) 652-683. https://doi.org/10.1097/GRF.0b013e31811ebef6</w:t>
       </w:r>
     </w:p>
     <w:p>
@@ -2333,7 +2333,7 @@
           <w:sz w:val="24"/>
           <w:szCs w:val="24"/>
         </w:rPr>
-        <w:t xml:space="preserve">[37] A.A. Freedman, et al., Patterns of placental pathology associated with preeclampsia, Placenta (2023). PMID: 37336159 [FLAG: add co-authors, volume, pages, and DOI]</w:t>
+        <w:t xml:space="preserve">[37] J.J. Wong, Y. Chakraborti, E.C. Caniglia, et al., Association between hypertensive disorders of pregnancy and infantile vascular anomalies in the Collaborative Perinatal Project, AJE Adv. 2 (2026) uuag016. https://doi.org/10.1093/ajeadv/uuag016</w:t>
       </w:r>
     </w:p>
     <w:p>
@@ -2347,7 +2347,7 @@
           <w:sz w:val="24"/>
           <w:szCs w:val="24"/>
         </w:rPr>
-        <w:t xml:space="preserve">[38] N. Auger, W.D. Fraser, L. Arbour, et al., Pre-eclampsia and risk of infantile haemangioma, Br. J. Dermatol. 176 (2017) 371-377. https://doi.org/10.1111/bjd.14958</w:t>
+        <w:t xml:space="preserve">[38] A.A. Freedman, et al., Patterns of placental pathology associated with preeclampsia, Placenta (2023). PMID: 37336159 [FLAG: add co-authors, volume, pages, and DOI]</w:t>
       </w:r>
     </w:p>
     <w:p>
@@ -2361,7 +2361,7 @@
           <w:sz w:val="24"/>
           <w:szCs w:val="24"/>
         </w:rPr>
-        <w:t xml:space="preserve">[39] K.M. Pittman, H.W. Losken, M.E. Kleinman, et al., No evidence for maternal-fetal microchimerism in infantile hemangioma: a molecular genetic investigation, J. Invest. Dermatol. 126 (2006) 2533-2538. https://doi.org/10.1038/sj.jid.5700516</w:t>
+        <w:t xml:space="preserve">[39] N. Auger, W.D. Fraser, L. Arbour, et al., Pre-eclampsia and risk of infantile haemangioma, Br. J. Dermatol. 176 (2017) 371-377. https://doi.org/10.1111/bjd.14958</w:t>
       </w:r>
     </w:p>
     <w:p>
@@ -2375,7 +2375,7 @@
           <w:sz w:val="24"/>
           <w:szCs w:val="24"/>
         </w:rPr>
-        <w:t xml:space="preserve">[40] E. Villamor-Martinez, et al., Chorioamnionitis as a risk factor for retinopathy of prematurity: an updated systematic review and meta-analysis, PLoS One 13 (2018) e0205838. https://doi.org/10.1371/journal.pone.0205838 [FLAG: add co-authors]</w:t>
+        <w:t xml:space="preserve">[40] K.M. Pittman, H.W. Losken, M.E. Kleinman, et al., No evidence for maternal-fetal microchimerism in infantile hemangioma: a molecular genetic investigation, J. Invest. Dermatol. 126 (2006) 2533-2538. https://doi.org/10.1038/sj.jid.5700516</w:t>
       </w:r>
     </w:p>
     <w:p>
@@ -2389,7 +2389,21 @@
           <w:sz w:val="24"/>
           <w:szCs w:val="24"/>
         </w:rPr>
-        <w:t xml:space="preserve">[41] Z.C. Chiesa Fuxench, N. Mitra, J. Wong, O. Hoffstad, S. Hinkle, D.J. Margolis, Maternal history of angioma is associated with infantile hemangioma and port-wine stain in children: a population-based, cohort study of mother-child pairs from the United Kingdom, Arch. Dermatol. Res. 316 (2024) 506. https://doi.org/10.1007/s00403-024-03247-y</w:t>
+        <w:t xml:space="preserve">[41] E. Villamor-Martinez, et al., Chorioamnionitis as a risk factor for retinopathy of prematurity: an updated systematic review and meta-analysis, PLoS One 13 (2018) e0205838. https://doi.org/10.1371/journal.pone.0205838 [FLAG: add co-authors]</w:t>
+      </w:r>
+    </w:p>
+    <w:p>
+      <w:pPr>
+        <w:spacing w:after="0" w:before="0" w:line="360"/>
+        <w:ind w:left="480" w:hanging="480"/>
+      </w:pPr>
+      <w:r>
+        <w:rPr>
+          <w:rFonts w:ascii="Times New Roman" w:cs="Times New Roman" w:eastAsia="Times New Roman" w:hAnsi="Times New Roman"/>
+          <w:sz w:val="24"/>
+          <w:szCs w:val="24"/>
+        </w:rPr>
+        <w:t xml:space="preserve">[42] Z.C. Chiesa Fuxench, N. Mitra, J. Wong, O. Hoffstad, S. Hinkle, D.J. Margolis, Maternal history of angioma is associated with infantile hemangioma and port-wine stain in children: a population-based, cohort study of mother-child pairs from the United Kingdom, Arch. Dermatol. Res. 316 (2024) 506. https://doi.org/10.1007/s00403-024-03247-y</w:t>
       </w:r>
     </w:p>
     <w:p>

</xml_diff>

<commit_message>
Remove interobserver agreement sentence from Discussion
Co-Authored-By: Claude Opus 5.5 <noreply@anthropic.com>
Claude-Session: https://claude.ai/code/session_017cSSzHhwQMgJphnHdZ9H9w
</commit_message>
<xml_diff>
--- a/cpp-placentas/manuscript/Wong_Placenta_IH_manuscript.docx
+++ b/cpp-placentas/manuscript/Wong_Placenta_IH_manuscript.docx
@@ -531,7 +531,7 @@
           <w:sz w:val="24"/>
           <w:szCs w:val="24"/>
         </w:rPr>
-        <w:t xml:space="preserve">3,559 (main text), 247 (abstract)</w:t>
+        <w:t xml:space="preserve">3,521 (main text), 247 (abstract)</w:t>
       </w:r>
     </w:p>
     <w:p>
@@ -554,7 +554,7 @@
           <w:sz w:val="24"/>
           <w:szCs w:val="24"/>
         </w:rPr>
-        <w:t xml:space="preserve">2. Figures: 1. Supplementary material: 1 file (Tables S1 to S10). References: 42</w:t>
+        <w:t xml:space="preserve">2. Figures: 1. Supplementary material: 1 file (Tables S1 to S10). References: 41</w:t>
       </w:r>
     </w:p>
     <w:p>
@@ -1395,7 +1395,7 @@
           <w:sz w:val="24"/>
           <w:szCs w:val="24"/>
         </w:rPr>
-        <w:t xml:space="preserve">Variation in placental diagnosis across centres is central to interpreting these findings, because the associations seen without adjustment for study site arose largely from comparisons between centres. MVM was recorded in 9.8% of placentas at one CPP centre and 80.3% at another, a range too wide to reflect differences in the populations alone. This is consistent with evidence that agreement between pathologists is only slight to fair for MVM, even when Amsterdam criteria are applied [21,35], and that agreement for AI, although high for its presence, is lower for staging [20,35]. Because IH prevalence also varied across centres, possibly reflecting differences in populations and in paediatric ascertainment, centre-level differences in diagnostic thresholds can confound the association between a recorded placental lesion and IH. Adjustment for study site compares placentas read within the same centre, and the resulting attenuation (MVM from 1.25 to 1.14, AI from 1.20 to 1.14) is consistent with removal of between-centre confounding. Estimates were similar when site was modelled as a random effect.</w:t>
+        <w:t xml:space="preserve">Variation in placental diagnosis across centres is central to interpreting these findings, because the associations seen without adjustment for study site arose largely from comparisons between centres. MVM was recorded in 9.8% of placentas at one CPP centre and 80.3% at another, a range too wide to reflect differences in the populations alone. Because IH prevalence also varied across centres, possibly reflecting differences in populations and in paediatric ascertainment, centre-level differences in diagnostic thresholds can confound the association between a recorded placental lesion and IH. Adjustment for study site compares placentas read within the same centre, and the resulting attenuation (MVM from 1.25 to 1.14, AI from 1.20 to 1.14) is consistent with removal of between-centre confounding. Estimates were similar when site was modelled as a random effect.</w:t>
       </w:r>
     </w:p>
     <w:p>
@@ -1409,7 +1409,7 @@
           <w:sz w:val="24"/>
           <w:szCs w:val="24"/>
         </w:rPr>
-        <w:t xml:space="preserve">The Boston centre, where one pathologist examined 92.6% of placentas [22], recorded AI more often than other centres, including foetal inflammation without a maternal response, a pattern that should be uncommon because a foetal response ordinarily follows a maternal one [20,36]. This suggests a lower diagnostic threshold, and shows that consistency within a single reader does not ensure comparability with other readers. Multicentre placental studies should therefore account for centre and, where possible, reader.</w:t>
+        <w:t xml:space="preserve">The Boston centre, where one pathologist examined 92.6% of placentas [22], recorded AI more often than other centres, including foetal inflammation without a maternal response, a pattern that should be uncommon because a foetal response ordinarily follows a maternal one [20,35]. This suggests a lower diagnostic threshold, and shows that consistency within a single reader does not ensure comparability with other readers. Multicentre placental studies should therefore account for centre and, where possible, reader.</w:t>
       </w:r>
     </w:p>
     <w:p>
@@ -1441,7 +1441,7 @@
           <w:sz w:val="24"/>
           <w:szCs w:val="24"/>
         </w:rPr>
-        <w:t xml:space="preserve">Earlier studies reported that placental anomalies were more common in pregnancies affected by IH [7,18]. These studies were small, used composite or selected exposures, and did not adjust for confounding, and the present estimates are considerably smaller. The findings are also consistent with a previous CPP analysis that found no clear association between hypertensive disorders of pregnancy and IH [37]. This may reflect that clinically defined hypertensive disorders are not consistently accompanied by MVM [38]. The findings also agree with evidence that the association between pre-eclampsia and IH in administrative data largely reflects greater surveillance of infants with longer neonatal stays [39]. Together, these studies suggest that placental vascular injury is not a major determinant of IH, and that any contribution is likely to be small.</w:t>
+        <w:t xml:space="preserve">Earlier studies reported that placental anomalies were more common in pregnancies affected by IH [7,18]. These studies were small, used composite or selected exposures, and did not adjust for confounding, and the present estimates are considerably smaller. The findings are also consistent with a previous CPP analysis that found no clear association between hypertensive disorders of pregnancy and IH [36]. This may reflect that clinically defined hypertensive disorders are not consistently accompanied by MVM [37]. The findings also agree with evidence that the association between pre-eclampsia and IH in administrative data largely reflects greater surveillance of infants with longer neonatal stays [38]. Together, these studies suggest that placental vascular injury is not a major determinant of IH, and that any contribution is likely to be small.</w:t>
       </w:r>
     </w:p>
     <w:p>
@@ -1473,7 +1473,7 @@
           <w:sz w:val="24"/>
           <w:szCs w:val="24"/>
         </w:rPr>
-        <w:t xml:space="preserve">The hypoxia hypothesis offers a plausible framework for a link between MVM and IH. IH shares markers and transcriptional programmes with placental tissue [9,10], and hypoxia-induced mediators of progenitor cell mobilisation are elevated in children with IH [11,14]. However, this evidence demonstrates a shared or hypoxia-responsive phenotype within established lesions rather than a causal effect of placental malperfusion, and genetic studies have not supported a maternal origin of IH cells [40]. The null finding for MVM does not refute the hypothesis, because a small effect cannot be excluded, but it provides no support for a strong link. The absence of a gradient by MVM grade argues against a strong effect, although incomplete capture of MVM lesions and misclassification would attenuate a true gradient. One possibility, consistent with the predominantly postnatal growth of IH, is that antenatal placental injury expands a susceptible population of endothelial progenitor cells, whereas postnatal hormonal and angiogenic signals determine whether it proliferates [2,3]. This two-stage model has not been tested prospectively.</w:t>
+        <w:t xml:space="preserve">The hypoxia hypothesis offers a plausible framework for a link between MVM and IH. IH shares markers and transcriptional programmes with placental tissue [9,10], and hypoxia-induced mediators of progenitor cell mobilisation are elevated in children with IH [11,14]. However, this evidence demonstrates a shared or hypoxia-responsive phenotype within established lesions rather than a causal effect of placental malperfusion, and genetic studies have not supported a maternal origin of IH cells [39]. The null finding for MVM does not refute the hypothesis, because a small effect cannot be excluded, but it provides no support for a strong link. The absence of a gradient by MVM grade argues against a strong effect, although incomplete capture of MVM lesions and misclassification would attenuate a true gradient. One possibility, consistent with the predominantly postnatal growth of IH, is that antenatal placental injury expands a susceptible population of endothelial progenitor cells, whereas postnatal hormonal and angiogenic signals determine whether it proliferates [2,3]. This two-stage model has not been tested prospectively.</w:t>
       </w:r>
     </w:p>
     <w:p>
@@ -1487,7 +1487,7 @@
           <w:sz w:val="24"/>
           <w:szCs w:val="24"/>
         </w:rPr>
-        <w:t xml:space="preserve">AI is a less plausible cause of IH. Histological AI generally reflects an inflammatory process close to delivery, often of infectious origin, and a direct effect on localised skin angiogenesis would require a systemic foetal inflammatory response with lasting consequences [17,36]. The higher estimate for low-stage than high-stage AI, the absence of a clear gradient from maternal to foetal involvement, and the centre-specific pattern of foetal-only inflammation all argue against a causal interpretation. For retinopathy of prematurity, another postnatal disorder of angiogenesis, the association with chorioamnionitis is largely explained by lower gestational age [41], and AI may similarly mark pathways to preterm birth rather than act on IH directly.</w:t>
+        <w:t xml:space="preserve">AI is a less plausible cause of IH. Histological AI generally reflects an inflammatory process close to delivery, often of infectious origin, and a direct effect on localised skin angiogenesis would require a systemic foetal inflammatory response with lasting consequences [17,35]. The higher estimate for low-stage than high-stage AI, the absence of a clear gradient from maternal to foetal involvement, and the centre-specific pattern of foetal-only inflammation all argue against a causal interpretation. For retinopathy of prematurity, another postnatal disorder of angiogenesis, the association with chorioamnionitis is largely explained by lower gestational age [40], and AI may similarly mark pathways to preterm birth rather than act on IH directly.</w:t>
       </w:r>
     </w:p>
     <w:p>
@@ -1547,7 +1547,7 @@
           <w:sz w:val="24"/>
           <w:szCs w:val="24"/>
         </w:rPr>
-        <w:t xml:space="preserve">Several limitations should be considered. First, despite the size of the cohort, IH is uncommon, and the study had limited power to detect small associations. Power to detect the observed RR of 1.14 was approximately 36% for MVM and 32% for AI, so small effects cannot be excluded. Second, the CPP predates the Amsterdam consensus, four lesions in the current MVM definition were not recorded [25], and both random and centre-specific exposure misclassification are likely. Third, IH was ascertained at a single examination at 12 months. Most IH reach their maximum size by five months of age and remain visible at one year [3], but small or involuting lesions may have been missed, and the diagnostic categories of the 1960s predate the modern classification of vascular anomalies. Outcome misclassification unrelated to placental pathology would most likely attenuate associations. Fourth, differences in IH ascertainment across centres may not be fully captured by adjustment for site. Fifth, residual confounding is possible, including by maternal history of angioma, an established risk factor that was not recorded [42]. Finally, gestational age and birthweight were not adjusted for because they may mediate effects of placental pathology [26], so estimates represent total effects.</w:t>
+        <w:t xml:space="preserve">Several limitations should be considered. First, despite the size of the cohort, IH is uncommon, and the study had limited power to detect small associations. Power to detect the observed RR of 1.14 was approximately 36% for MVM and 32% for AI, so small effects cannot be excluded. Second, the CPP predates the Amsterdam consensus, four lesions in the current MVM definition were not recorded [25], and both random and centre-specific exposure misclassification are likely. Third, IH was ascertained at a single examination at 12 months. Most IH reach their maximum size by five months of age and remain visible at one year [3], but small or involuting lesions may have been missed, and the diagnostic categories of the 1960s predate the modern classification of vascular anomalies. Outcome misclassification unrelated to placental pathology would most likely attenuate associations. Fourth, differences in IH ascertainment across centres may not be fully captured by adjustment for site. Fifth, residual confounding is possible, including by maternal history of angioma, an established risk factor that was not recorded [41]. Finally, gestational age and birthweight were not adjusted for because they may mediate effects of placental pathology [26], so estimates represent total effects.</w:t>
       </w:r>
     </w:p>
     <w:p>
@@ -2305,7 +2305,7 @@
           <w:sz w:val="24"/>
           <w:szCs w:val="24"/>
         </w:rPr>
-        <w:t xml:space="preserve">[35] R.W. Redline, T. Vik, A. Heerema-McKenney, et al., Interobserver reliability for identifying specific patterns of placental injury as defined by the Amsterdam classification, Arch. Pathol. Lab. Med. 146 (2022) 372-378. https://doi.org/10.5858/arpa.2020-0753-OA</w:t>
+        <w:t xml:space="preserve">[35] F. Gotsch, R. Romero, J.P. Kusanovic, et al., The fetal inflammatory response syndrome, Clin. Obstet. Gynecol. 50 (2007) 652-683. https://doi.org/10.1097/GRF.0b013e31811ebef6</w:t>
       </w:r>
     </w:p>
     <w:p>
@@ -2319,7 +2319,7 @@
           <w:sz w:val="24"/>
           <w:szCs w:val="24"/>
         </w:rPr>
-        <w:t xml:space="preserve">[36] F. Gotsch, R. Romero, J.P. Kusanovic, et al., The fetal inflammatory response syndrome, Clin. Obstet. Gynecol. 50 (2007) 652-683. https://doi.org/10.1097/GRF.0b013e31811ebef6</w:t>
+        <w:t xml:space="preserve">[36] J.J. Wong, Y. Chakraborti, E.C. Caniglia, et al., Association between hypertensive disorders of pregnancy and infantile vascular anomalies in the Collaborative Perinatal Project, AJE Adv. 2 (2026) uuag016. https://doi.org/10.1093/ajeadv/uuag016</w:t>
       </w:r>
     </w:p>
     <w:p>
@@ -2333,7 +2333,7 @@
           <w:sz w:val="24"/>
           <w:szCs w:val="24"/>
         </w:rPr>
-        <w:t xml:space="preserve">[37] J.J. Wong, Y. Chakraborti, E.C. Caniglia, et al., Association between hypertensive disorders of pregnancy and infantile vascular anomalies in the Collaborative Perinatal Project, AJE Adv. 2 (2026) uuag016. https://doi.org/10.1093/ajeadv/uuag016</w:t>
+        <w:t xml:space="preserve">[37] A.A. Freedman, et al., Patterns of placental pathology associated with preeclampsia, Placenta (2023). PMID: 37336159 [FLAG: add co-authors, volume, pages, and DOI]</w:t>
       </w:r>
     </w:p>
     <w:p>
@@ -2347,7 +2347,7 @@
           <w:sz w:val="24"/>
           <w:szCs w:val="24"/>
         </w:rPr>
-        <w:t xml:space="preserve">[38] A.A. Freedman, et al., Patterns of placental pathology associated with preeclampsia, Placenta (2023). PMID: 37336159 [FLAG: add co-authors, volume, pages, and DOI]</w:t>
+        <w:t xml:space="preserve">[38] N. Auger, W.D. Fraser, L. Arbour, et al., Pre-eclampsia and risk of infantile haemangioma, Br. J. Dermatol. 176 (2017) 371-377. https://doi.org/10.1111/bjd.14958</w:t>
       </w:r>
     </w:p>
     <w:p>
@@ -2361,7 +2361,7 @@
           <w:sz w:val="24"/>
           <w:szCs w:val="24"/>
         </w:rPr>
-        <w:t xml:space="preserve">[39] N. Auger, W.D. Fraser, L. Arbour, et al., Pre-eclampsia and risk of infantile haemangioma, Br. J. Dermatol. 176 (2017) 371-377. https://doi.org/10.1111/bjd.14958</w:t>
+        <w:t xml:space="preserve">[39] K.M. Pittman, H.W. Losken, M.E. Kleinman, et al., No evidence for maternal-fetal microchimerism in infantile hemangioma: a molecular genetic investigation, J. Invest. Dermatol. 126 (2006) 2533-2538. https://doi.org/10.1038/sj.jid.5700516</w:t>
       </w:r>
     </w:p>
     <w:p>
@@ -2375,7 +2375,7 @@
           <w:sz w:val="24"/>
           <w:szCs w:val="24"/>
         </w:rPr>
-        <w:t xml:space="preserve">[40] K.M. Pittman, H.W. Losken, M.E. Kleinman, et al., No evidence for maternal-fetal microchimerism in infantile hemangioma: a molecular genetic investigation, J. Invest. Dermatol. 126 (2006) 2533-2538. https://doi.org/10.1038/sj.jid.5700516</w:t>
+        <w:t xml:space="preserve">[40] E. Villamor-Martinez, et al., Chorioamnionitis as a risk factor for retinopathy of prematurity: an updated systematic review and meta-analysis, PLoS One 13 (2018) e0205838. https://doi.org/10.1371/journal.pone.0205838 [FLAG: add co-authors]</w:t>
       </w:r>
     </w:p>
     <w:p>
@@ -2389,21 +2389,7 @@
           <w:sz w:val="24"/>
           <w:szCs w:val="24"/>
         </w:rPr>
-        <w:t xml:space="preserve">[41] E. Villamor-Martinez, et al., Chorioamnionitis as a risk factor for retinopathy of prematurity: an updated systematic review and meta-analysis, PLoS One 13 (2018) e0205838. https://doi.org/10.1371/journal.pone.0205838 [FLAG: add co-authors]</w:t>
-      </w:r>
-    </w:p>
-    <w:p>
-      <w:pPr>
-        <w:spacing w:after="0" w:before="0" w:line="360"/>
-        <w:ind w:left="480" w:hanging="480"/>
-      </w:pPr>
-      <w:r>
-        <w:rPr>
-          <w:rFonts w:ascii="Times New Roman" w:cs="Times New Roman" w:eastAsia="Times New Roman" w:hAnsi="Times New Roman"/>
-          <w:sz w:val="24"/>
-          <w:szCs w:val="24"/>
-        </w:rPr>
-        <w:t xml:space="preserve">[42] Z.C. Chiesa Fuxench, N. Mitra, J. Wong, O. Hoffstad, S. Hinkle, D.J. Margolis, Maternal history of angioma is associated with infantile hemangioma and port-wine stain in children: a population-based, cohort study of mother-child pairs from the United Kingdom, Arch. Dermatol. Res. 316 (2024) 506. https://doi.org/10.1007/s00403-024-03247-y</w:t>
+        <w:t xml:space="preserve">[41] Z.C. Chiesa Fuxench, N. Mitra, J. Wong, O. Hoffstad, S. Hinkle, D.J. Margolis, Maternal history of angioma is associated with infantile hemangioma and port-wine stain in children: a population-based, cohort study of mother-child pairs from the United Kingdom, Arch. Dermatol. Res. 316 (2024) 506. https://doi.org/10.1007/s00403-024-03247-y</w:t>
       </w:r>
     </w:p>
     <w:p>

</xml_diff>

<commit_message>
Revise manuscript with Stefanie Hinkle and Ellen Francis edits
Reframes the paper around the joint MVM and AI finding, describes the
single-lesion estimates as small but imprecise, condenses the study
site discussion into the limitations, applies Ellen's Comparison and
Biological interpretation rewrites with factual corrections, puts the
joint exposure first in Table 2, renumbers the supplement in citation
order, and adds a round-two response table.

Co-Authored-By: Claude Opus 5.5 <noreply@anthropic.com>
Claude-Session: https://claude.ai/code/session_017cSSzHhwQMgJphnHdZ9H9w
</commit_message>
<xml_diff>
--- a/cpp-placentas/manuscript/Wong_Placenta_IH_manuscript.docx
+++ b/cpp-placentas/manuscript/Wong_Placenta_IH_manuscript.docx
@@ -531,7 +531,7 @@
           <w:sz w:val="24"/>
           <w:szCs w:val="24"/>
         </w:rPr>
-        <w:t xml:space="preserve">3,521 (main text), 247 (abstract)</w:t>
+        <w:t xml:space="preserve">2,944 (main text), 248 (abstract)</w:t>
       </w:r>
     </w:p>
     <w:p>
@@ -554,7 +554,7 @@
           <w:sz w:val="24"/>
           <w:szCs w:val="24"/>
         </w:rPr>
-        <w:t xml:space="preserve">2. Figures: 1. Supplementary material: 1 file (Tables S1 to S10). References: 41</w:t>
+        <w:t xml:space="preserve">2. Figures: 1. Supplementary material: 1 file (Tables S1 to S10). References: 40</w:t>
       </w:r>
     </w:p>
     <w:p>
@@ -623,7 +623,7 @@
           <w:sz w:val="24"/>
           <w:szCs w:val="24"/>
         </w:rPr>
-        <w:t xml:space="preserve">Infantile haemangioma (IH), the most common tumour of infancy, is a raised, bright-red dermatological lesion appearing within weeks of birth, most often on the head, neck, or trunk, and affects 1.5% to 4.4% of newborns. Perinatal risk factors implicate the maternal-placental-foetal unit, yet placental injury patterns remain unexamined.</w:t>
+        <w:t xml:space="preserve">Infantile haemangioma (IH), the most common tumour of infancy, is a raised, bright-red skin lesion that appears within weeks of birth and affects 1.5% to 4.4% of newborns. Perinatal risk factors implicate the maternal-placental-foetal unit, yet placental injury patterns remain unexamined.</w:t>
       </w:r>
     </w:p>
     <w:p>
@@ -646,7 +646,7 @@
           <w:sz w:val="24"/>
           <w:szCs w:val="24"/>
         </w:rPr>
-        <w:t xml:space="preserve">This analysis included 45,268 singleton pregnancies from the Collaborative Perinatal Project, a prospective cohort enrolled across 12 US centres (1959 to 1965) with systematic placental histopathology. Exposures were (1) maternal vascular malperfusion (MVM) and (2) acute inflammation (AI), each as present or absent and as a continuous score, and (3) a joint exposure (neither, MVM only, AI only, or both). Standardised paediatrician examinations ascertained IH by age one. Adjusted relative risks (aRR) and 95% confidence intervals (CI) were estimated by modified Poisson regression with 11 covariates, study site, and stabilised inverse probability of censoring weights.</w:t>
+        <w:t xml:space="preserve">This analysis included 45,268 singleton pregnancies from the Collaborative Perinatal Project, a prospective cohort enrolled across 12 US centres (1959 to 1965) with systematic placental histopathology. Exposures were (1) maternal vascular malperfusion (MVM) and (2) acute inflammation (AI), each as present or absent and as a continuous score, and (3) a joint exposure (neither, MVM only, AI only, or both). Standardised paediatrician examinations ascertained IH by age one. Adjusted relative risks (aRR) were estimated by modified Poisson regression with 11 covariates, study site, and inverse probability of censoring weights.</w:t>
       </w:r>
     </w:p>
     <w:p>
@@ -669,7 +669,7 @@
           <w:sz w:val="24"/>
           <w:szCs w:val="24"/>
         </w:rPr>
-        <w:t xml:space="preserve">MVM was present in 13,119 (29.0%) pregnancies and AI in 10,188 (22.5%). IH developed in 700 of 40,700 infants (1.7%). Neither MVM (aRR 1.14, 95% CI 0.96, 1.35) nor AI (aRR 1.14, 95% CI 0.96, 1.35) was associated with IH, nor were the MVM score (aRR 1.05, 95% CI 0.97, 1.15) or AI score (aRR 1.03, 95% CI 0.98, 1.08). Infants whose placentas showed both MVM and AI had higher IH risk than those with neither (aRR 1.37, 95% CI 1.05, 1.78).</w:t>
+        <w:t xml:space="preserve">Of 40,700 infants examined at one year, 700 (1.7%) had IH. Infants whose placentas showed both MVM and AI had higher IH risk than those with neither (aRR 1.37, 95% CI 1.05, 1.78). MVM (aRR 1.14, 95% CI 0.96, 1.35) and AI (aRR 1.14, 95% CI 0.96, 1.35) alone were associated with modestly higher but imprecise IH risk, as were the MVM score (range 0 to 8, aRR 1.05 per unit, 95% CI 0.97, 1.15) and AI score (range 0 to 7, aRR 1.03 per unit, 95% CI 0.98, 1.08).</w:t>
       </w:r>
     </w:p>
     <w:p>
@@ -684,7 +684,7 @@
           <w:sz w:val="24"/>
           <w:szCs w:val="24"/>
         </w:rPr>
-        <w:t xml:space="preserve">Discussion: </w:t>
+        <w:t xml:space="preserve">Conclusion: </w:t>
       </w:r>
       <w:r>
         <w:rPr>
@@ -692,7 +692,7 @@
           <w:sz w:val="24"/>
           <w:szCs w:val="24"/>
         </w:rPr>
-        <w:t xml:space="preserve">Neither placental MVM nor AI was associated with IH, although having both lesions was associated with higher risk.</w:t>
+        <w:t xml:space="preserve">Placentas with both MVM and AI carried a higher IH risk, suggesting that chronic malperfusion and acute inflammation may act together in IH development.</w:t>
       </w:r>
     </w:p>
     <w:p>
@@ -759,7 +759,7 @@
           <w:sz w:val="24"/>
           <w:szCs w:val="24"/>
         </w:rPr>
-        <w:t xml:space="preserve">• Placental MVM and AI alone were not associated with infantile haemangioma</w:t>
+        <w:t xml:space="preserve">• Haemangioma risk was higher when placentas had both malperfusion and inflammation</w:t>
       </w:r>
     </w:p>
     <w:p>
@@ -772,7 +772,7 @@
           <w:sz w:val="24"/>
           <w:szCs w:val="24"/>
         </w:rPr>
-        <w:t xml:space="preserve">• Haemangioma risk was higher when placentas showed both MVM and AI</w:t>
+        <w:t xml:space="preserve">• Malperfusion or inflammation alone showed small, imprecise increases in risk</w:t>
       </w:r>
     </w:p>
     <w:p>
@@ -785,20 +785,7 @@
           <w:sz w:val="24"/>
           <w:szCs w:val="24"/>
         </w:rPr>
-        <w:t xml:space="preserve">• Placental diagnoses varied several-fold across the 12 study centres</w:t>
-      </w:r>
-    </w:p>
-    <w:p>
-      <w:pPr>
-        <w:spacing w:after="0" w:before="0" w:line="480"/>
-      </w:pPr>
-      <w:r>
-        <w:rPr>
-          <w:rFonts w:ascii="Times New Roman" w:cs="Times New Roman" w:eastAsia="Times New Roman" w:hAnsi="Times New Roman"/>
-          <w:sz w:val="24"/>
-          <w:szCs w:val="24"/>
-        </w:rPr>
-        <w:t xml:space="preserve">• Multicentre placental studies should account for centre and pathologist</w:t>
+        <w:t xml:space="preserve">• Chronic and acute placental injury may act together in haemangioma development</w:t>
       </w:r>
     </w:p>
     <w:p>
@@ -835,7 +822,7 @@
           <w:sz w:val="24"/>
           <w:szCs w:val="24"/>
         </w:rPr>
-        <w:t xml:space="preserve">Infantile haemangioma (IH) is the most common tumour of infancy, affecting approximately 1.5% to 4.4% of infants [1]. IH typically presents as a raised, bright-red lesion in the first weeks after birth, most often on the head, neck, or trunk, and proliferates rapidly during the first months of life before slowly involuting [2,3]. Lesions on the face, airway, or other anatomically sensitive sites can cause visual obstruction, airway compromise, ulceration, and lasting disfigurement [2,4]. Despite this burden, the aetiology of IH remains incompletely understood. The most consistently reported risk factors, including female sex, preterm birth, low birthweight, and multiple gestation, together with more variably reported factors such as placenta praevia and pre-eclampsia, point to the maternal-placental-foetal unit as a plausible origin [5–8].</w:t>
+        <w:t xml:space="preserve">Infantile haemangioma (IH) is the most common tumour of infancy, affecting approximately 1.5% to 4.4% of infants [1]. IH typically presents as a raised, bright-red lesion in the first weeks after birth, most often on the head, neck, or trunk, and proliferates rapidly during the first months of life before slowly resolving [2,3]. Lesions on the face, airway, or other anatomically sensitive sites can cause visual obstruction, airway compromise, ulceration, and lasting disfigurement [2,4]. Despite this burden, the aetiology of IH remains incompletely understood. The most consistently reported risk factors (e.g., female sex, preterm birth, low birthweight, and multiple gestation), together with more variably reported factors (e.g., placenta praevia and pre-eclampsia), point to the maternal-placental-foetal unit as a plausible origin [5–8].</w:t>
       </w:r>
     </w:p>
     <w:p>
@@ -849,7 +836,7 @@
           <w:sz w:val="24"/>
           <w:szCs w:val="24"/>
         </w:rPr>
-        <w:t xml:space="preserve">Several lines of evidence link IH to the placenta. IH endothelial cells share a distinctive immunophenotype with placental microvessels, including expression of glucose transporter 1, merosin, Lewis Y antigen, and FcγRII [9], and IH and placenta show closely related transcriptional profiles [10]. Proliferating IH displays a hypoxia-responsive phenotype, hypoxia-induced mediators of progenitor cell mobilisation are elevated in affected children [11,12], and clinical and histological observations have linked placental hypoxia to neonatal haemangioma [13]. These observations have led to the hypothesis that placental injury, and the intrauterine hypoxia or inflammation that accompanies it, may prime the development of IH [2,14]. Contemporary placental pathology classifies lesions into injury patterns that reflect distinct biological processes [15,16]. Two patterns are of particular relevance. Maternal vascular malperfusion (MVM) reflects impaired uteroplacental perfusion and oxygenation, and acute inflammation (AI) reflects neutrophilic infiltration of the placental membranes and foetal vessels in response to an inflammatory intrauterine milieu [16,17].</w:t>
+        <w:t xml:space="preserve">Several lines of evidence link IH to the placenta. IH endothelial cells share a distinctive immunophenotype with placental microvessels, including expression of glucose transporter 1, merosin, Lewis Y antigen, and FcγRII [9], and IH and placenta show closely related transcriptional profiles [10]. Proliferating IH displays a hypoxia-responsive phenotype, hypoxia-induced mediators of progenitor cell mobilisation are elevated in affected children [11,12], and clinical and histological observations have linked placental hypoxia to neonatal haemangioma [13]. These observations have led to the hypothesis that placental injury, and the intrauterine hypoxia or inflammation that accompanies it, may prime the development of IH [2,14].</w:t>
       </w:r>
     </w:p>
     <w:p>
@@ -863,7 +850,21 @@
           <w:sz w:val="24"/>
           <w:szCs w:val="24"/>
         </w:rPr>
-        <w:t xml:space="preserve">Few epidemiological studies have examined the placenta in relation to IH. In a prospective cohort of 594 infants with 27 IH cases, placental anomalies, a composite of clinical and pathological conditions including pre-eclampsia, placenta praevia, and growth restriction, were approximately twice as common in IH-affected pregnancies [7]. Among 26 very-low-birthweight infants, extensive infarction or retroplacental haematoma was reported in all 13 placentas from infants with IH [18], whereas a Swedish case-control study found no association between placental chorangioma and parent-reported IH [19]. These studies were small, drawn from selected clinical populations, and unadjusted for confounding, and none examined contemporary patterns of placental injury. Placental histopathology is also challenging to study across centres, because diagnostic thresholds for MVM and AI vary between pathologists and institutions [20–22].</w:t>
+        <w:t xml:space="preserve">Contemporary placental pathology classifies lesions into injury patterns that reflect distinct biological processes [15,16]. Two patterns are of particular relevance. Maternal vascular malperfusion (MVM) reflects impaired uteroplacental perfusion and oxygenation, and acute inflammation (AI) reflects neutrophilic infiltration of the placental membranes and foetal vessels in response to an inflammatory intrauterine milieu [16,17].</w:t>
+      </w:r>
+    </w:p>
+    <w:p>
+      <w:pPr>
+        <w:spacing w:after="0" w:before="0" w:line="480"/>
+        <w:ind w:firstLine="480"/>
+      </w:pPr>
+      <w:r>
+        <w:rPr>
+          <w:rFonts w:ascii="Times New Roman" w:cs="Times New Roman" w:eastAsia="Times New Roman" w:hAnsi="Times New Roman"/>
+          <w:sz w:val="24"/>
+          <w:szCs w:val="24"/>
+        </w:rPr>
+        <w:t xml:space="preserve">Few epidemiological studies have examined the placenta in relation to IH. In a prospective cohort of 594 infants with 27 IH cases, placental anomalies (i.e., a composite of clinical and pathological conditions including pre-eclampsia, placenta praevia, and growth restriction) were approximately twice as common in IH-affected pregnancies [7]. Among 26 very-low-birthweight infants, extensive infarction or retroplacental haematoma was reported in all 13 placentas from infants with IH [18], whereas a Swedish case-control study found no association between placental chorangioma and parent-reported IH [19]. These studies were small, drawn from selected clinical populations, and unadjusted for confounding, and none examined contemporary patterns of placental injury or their co-occurrence. Placental histopathology is also challenging to study across centres, because diagnostic thresholds for MVM and AI vary between pathologists and institutions [20–22].</w:t>
       </w:r>
     </w:p>
     <w:p>
@@ -927,7 +928,7 @@
           <w:sz w:val="24"/>
           <w:szCs w:val="24"/>
         </w:rPr>
-        <w:t xml:space="preserve">The CPP was a prospective cohort study conducted by the National Institute of Neurological Diseases and Stroke to examine perinatal factors in relation to neurological and developmental outcomes in offspring [23,24]. Pregnant women were enrolled at their first antenatal visit at 12 US clinical centres from 1959 to 1965, with deliveries continuing into 1966. Placentas were examined by trained study pathologists at each centre using a standardised protocol [25], and offspring underwent standardised examinations by study paediatricians at 12 months of age. The de-identified CPP data are publicly available through the US National Archives and Records Administration.</w:t>
+        <w:t xml:space="preserve">The CPP was a prospective cohort study of perinatal factors in relation to neurological and developmental outcomes in offspring [23,24]. Pregnant women were enrolled at their first antenatal visit at 12 US clinical centres from 1959 to 1965, with deliveries continuing into 1966. Placentas were examined by trained study pathologists at each centre using a standardised protocol [25], and offspring underwent standardised examinations by study paediatricians at 12 months of age. The de-identified CPP data are publicly available through the US National Archives and Records Administration.</w:t>
       </w:r>
     </w:p>
     <w:p>
@@ -941,7 +942,7 @@
           <w:sz w:val="24"/>
           <w:szCs w:val="24"/>
         </w:rPr>
-        <w:t xml:space="preserve">Of 59,391 pregnancies (infants) in the CPP, 47,090 had a placental pathology record (Fig. 1). Multiple gestations (n = 933) were excluded because twins may share a placenta, particularly in monochorionic pregnancies, so placental lesions cannot be assigned to the intrauterine exposure of an individual infant, and because multiple gestation is strongly associated with both placental pathology and IH [5]. Plurality was taken from the CPP delivery record and cross-checked against the placental pathology file. After further excluding pregnancies with a missing MVM score (n = 887) or missing AI data (n = 2), the analytic sample comprised 45,268 singleton pregnancies. This secondary analysis of de-identified, publicly available data was determined exempt by the University of Pennsylvania Institutional Review Board.</w:t>
+        <w:t xml:space="preserve">Of 59,391 infants in the CPP, 47,090 had a placental pathology record (Fig. 1). Multiple gestations (n = 933) were excluded because twins may share a placenta, particularly in monochorionic pregnancies, so placental lesions cannot be assigned to the intrauterine exposure of an individual infant, and because multiple gestation is strongly associated with both placental pathology and IH [5]. Plurality was taken from the CPP delivery record and cross-checked against the placental pathology file. After further excluding pregnancies with a missing MVM score (n = 887) or missing AI data (n = 2), the analytic sample comprised 45,268 singleton pregnancies. This secondary analysis of de-identified, publicly available data was determined exempt by the University of Pennsylvania Institutional Review Board.</w:t>
       </w:r>
     </w:p>
     <w:p>
@@ -973,7 +974,7 @@
           <w:sz w:val="24"/>
           <w:szCs w:val="24"/>
         </w:rPr>
-        <w:t xml:space="preserve">Placental examinations recorded individual lesions by anatomical location, including the umbilical cord, membranes, decidua, villi, and intervillous space. Consistent with contemporary classifications [15,16], individual lesions were organised by the authors into patterns of injury, as previously described for this cohort [25]. The MVM score summed the available MVM lesions (retroplacental haematoma, increased perivillous fibrin deposition, increased syncytial knots, single infarct, multiple infarcts, intervillous thrombus with adjacent villous infarction, decidual vascular thrombosis, fibrinoid necrosis, and atherosis), with one point for each lesion, and two additional points if the placenta had at least one MVM lesion and weighed less than the 10th percentile for gestational age based on an internal CPP reference [25]. Four lesions in the current MVM definition were not recorded in the CPP [25]. MVM was analysed as present (score of one or more) versus absent, as a continuous score (observed range 0 to 8), and as grade (none, low [score 1 to 2], or high [score 3 or more]).</w:t>
+        <w:t xml:space="preserve">Placental examinations recorded individual lesions by anatomical location, including the umbilical cord, membranes, decidua, villi, and intervillous space. Consistent with contemporary classifications [15,16], individual lesions were organised by the authors into patterns of injury, as previously described for this cohort [25]. The MVM score summed the available MVM lesions (i.e., retroplacental haematoma, increased perivillous fibrin deposition, increased syncytial knots, single infarct, multiple infarcts, intervillous thrombus with adjacent villous infarction, decidual vascular thrombosis, fibrinoid necrosis, and atherosis), with one point for each lesion, and two additional points if the placenta had at least one MVM lesion and weighed less than the 10th percentile for gestational age based on an internal CPP reference [25]. Four lesions in the current MVM definition were not recorded in the CPP [25]. MVM was analysed as present (score of one or more) versus absent, as a continuous score (observed range 0 to 8), and as grade (none, low [score 1 to 2], or high [score 3 or more]).</w:t>
       </w:r>
     </w:p>
     <w:p>
@@ -987,7 +988,7 @@
           <w:sz w:val="24"/>
           <w:szCs w:val="24"/>
         </w:rPr>
-        <w:t xml:space="preserve">AI was defined as neutrophilic infiltration, graded 0 to 3, in any of seven compartments. The amnion and chorion of the membrane roll and of the placental surface represented the maternal inflammatory response, and the umbilical vein, umbilical artery, and foetal surface vessels represented the foetal inflammatory response [15,20]. AI was analysed as present versus absent, as a score counting the number of involved compartments (0 to 7), as stage (none, low, or high) as recorded in the CPP placental dataset, and by location (maternal only, foetal only, or both).</w:t>
+        <w:t xml:space="preserve">AI was defined as neutrophilic infiltration, graded 0 to 3, in any of seven compartments. The amnion and chorion of the membrane roll and of the placental surface represented the maternal inflammatory response, and the umbilical vein, umbilical artery, and foetal surface vessels represented the foetal inflammatory response [15,20]. AI was analysed as present versus absent, as a score counting the number of involved compartments (0 to 7), as stage (none, low, or high) as recorded in the CPP placental dataset, and by maternal or foetal involvement (maternal response only, foetal response only, or both).</w:t>
       </w:r>
     </w:p>
     <w:p>
@@ -1019,7 +1020,7 @@
           <w:sz w:val="24"/>
           <w:szCs w:val="24"/>
         </w:rPr>
-        <w:t xml:space="preserve">Study paediatricians examined surviving offspring at approximately 12 months of age using a standardised protocol and recorded IH as definite, suspect, or absent. The primary outcome was definite IH. In a prespecified sensitivity analysis, suspect cases were also classified as IH.</w:t>
+        <w:t xml:space="preserve">Study paediatricians examined surviving offspring at approximately 12 months of age using a standardised protocol and recorded IH as definite, suspect, or absent. The primary outcome was definite IH. In a sensitivity analysis, suspect cases were also classified as IH.</w:t>
       </w:r>
     </w:p>
     <w:p>
@@ -1051,7 +1052,7 @@
           <w:sz w:val="24"/>
           <w:szCs w:val="24"/>
         </w:rPr>
-        <w:t xml:space="preserve">Confounders were selected a priori as potential common causes of placental pathology and IH and were measured before pregnancy or at enrolment. They were maternal age (continuous), pre-pregnancy body mass index (continuous), race and ethnicity (White [reference], Black, Puerto Rican, or other), education (less than high school [reference], some high school, high school graduate, or some college or more), annual family income (seven categories, with $4,000 to $5,999 as reference), marital status (married or common law [reference], single, or widowed, divorced, or separated), smoking (none [reference], 1 to 19, or 20 or more cigarettes per day), parity (0 [reference], 1, 2, 3, or 4 or more), pre-pregnancy diabetes, chronic hypertension (including superimposed pre-eclampsia), and infant sex (female [reference] or male). Race and ethnicity was included as a marker of social and structural factors that may influence both health and diagnosis. Study site was included in the primary model because placental diagnoses and IH prevalence varied markedly across centres. Gestational age, birthweight, and hypertensive disorders arising during pregnancy were not adjusted for because they may lie on the pathway between placental pathology and IH [26]. Small for gestational age (SGA), shown descriptively, was defined as birthweight below the 10th percentile for gestational age and sex based on an internal CPP reference.</w:t>
+        <w:t xml:space="preserve">Confounders were selected a priori as potential common causes of placental pathology and IH and were measured before pregnancy or at enrolment. They were maternal age (continuous), pre-pregnancy body mass index (continuous), race and ethnicity (White [reference], Black, Puerto Rican, or other), education (less than high school [reference], some high school, high school graduate, or some college or more), annual family income (seven categories, with $4,000 to $5,999 as reference), marital status (married or common law [reference], single, or widowed, divorced, or separated), smoking (none [reference], 1 to 19, or 20 or more cigarettes per day), parity (0 [reference], 1, 2, 3, or 4 or more), pre-pregnancy diabetes, chronic hypertension, and infant sex (female [reference] or male). Race and ethnicity were included as a marker of social and structural factors that may influence both health and diagnosis. Study site was included in the primary model because placental diagnoses and IH prevalence varied across centres. Gestational age, birthweight, and hypertensive disorders arising during pregnancy were not adjusted for because they may lie on the pathway between placental pathology and IH [26]. Small for gestational age, shown descriptively, was defined as birthweight below the 10th percentile for gestational age and sex based on an internal CPP reference.</w:t>
       </w:r>
     </w:p>
     <w:p>
@@ -1097,7 +1098,7 @@
           <w:sz w:val="24"/>
           <w:szCs w:val="24"/>
         </w:rPr>
-        <w:t xml:space="preserve">Of the 45,268 infants, 1,834 (4.1%) died before the one-year examination and 2,734 (6.0%) survived without an IH examination. To reduce selection bias from restricting analyses to infants with an observed outcome [29], stabilised inverse probability of censoring weights were estimated within each imputed dataset. The denominator model included MVM, AI, all covariates, and study site, and the numerator model included an intercept only [30]. Weights ranged from 0.91 to 1.81.</w:t>
+        <w:t xml:space="preserve">Of the 45,268 infants, 1,834 (4.1%) died before the one-year examination and, among those who survived, 2,734 (6.3%) did not have an IH examination. To reduce selection bias from restricting analyses to infants with an observed outcome, stabilised inverse probability of censoring weights were estimated within each imputed dataset [29]. The denominator model included MVM, AI, all covariates, and study site, and the numerator model included an intercept only [30].</w:t>
       </w:r>
     </w:p>
     <w:p>
@@ -1125,7 +1126,7 @@
           <w:sz w:val="24"/>
           <w:szCs w:val="24"/>
         </w:rPr>
-        <w:t xml:space="preserve">Sensitivity analyses examined (1) MVM grade and AI stage (i.e., none [reference], low, or high, to assess whether IH risk increased with lesion severity), (2) AI by maternal or foetal involvement (i.e., maternal response only [amnion or chorion], foetal response only [umbilical vessels or foetal surface vessels], or both, compared with no AI), (3) sequential addition of covariate groups and study site, (4) study site as a random intercept instead of a fixed effect, (5) stratification by the Boston centre, where 92.6% of placentas were examined by one pathologist [22], versus the other 11 centres, and (6) the broader outcome that included suspect IH.</w:t>
+        <w:t xml:space="preserve">Sensitivity analyses examined (1) MVM grade and AI stage (i.e., none [reference], low, or high, to assess whether IH risk increased with lesion severity), (2) AI by maternal or foetal involvement (i.e., maternal response only [amnion or chorion], foetal response only [umbilical vessels or foetal surface vessels], or both, compared with no AI), (3) sequential addition of covariate groups and study site, (4) study site as a random intercept instead of a fixed effect, (5) stratification by the Boston centre, where 92.6% of placentas were examined by one pathologist [22], versus the other 11 centres, and (6) the broader outcome that included suspect IH. All analyses were conducted in R version 4.3.3.</w:t>
       </w:r>
     </w:p>
     <w:p>
@@ -1175,21 +1176,7 @@
           <w:sz w:val="24"/>
           <w:szCs w:val="24"/>
         </w:rPr>
-        <w:t xml:space="preserve">Of 45,268 pregnancies, 29.0% (13,119) had any MVM, 22.5% (10,188) had any AI, and 7.9% (3,554) had both (Table 1). Pregnancies with MVM more often involved women with less than a high school education (19.7% vs 16.3%), pre-pregnancy diabetes (2.1% vs 1.3%), and chronic hypertension (6.3% vs 5.6%). Pregnancies with AI more often involved White women (52.3% vs 47.0%), heavy smoking (20.5% vs 16.6%), and male infants (53.4% vs 50.2%). Of the 40,700 infants (89.9%) examined at one year, 1.7% (700) had definite IH and a further 0.6% (230) had suspect IH (Supplementary Table S1).</w:t>
-      </w:r>
-    </w:p>
-    <w:p>
-      <w:pPr>
-        <w:spacing w:after="0" w:before="0" w:line="480"/>
-        <w:ind w:firstLine="480"/>
-      </w:pPr>
-      <w:r>
-        <w:rPr>
-          <w:rFonts w:ascii="Times New Roman" w:cs="Times New Roman" w:eastAsia="Times New Roman" w:hAnsi="Times New Roman"/>
-          <w:sz w:val="24"/>
-          <w:szCs w:val="24"/>
-        </w:rPr>
-        <w:t xml:space="preserve">Across centres, any MVM ranged from 9.8% to 80.3%, any AI from 14.5% to 38.1%, and definite IH from 0.4% to 3.6%, with Boston contributing 41.4% (290/700) of IH cases (Supplementary Table S2).</w:t>
+        <w:t xml:space="preserve">Of 45,268 pregnancies, 29.0% (13,119) had any MVM, 22.5% (10,188) had any AI, and 7.9% (3,554) had both (Table 1). Pregnancies with MVM more often involved women with less than a high school education (19.7% vs 16.3%), pre-pregnancy diabetes (2.1% vs 1.3%), and chronic hypertension (6.3% vs 5.6%). Pregnancies with AI more often involved White women (52.3% vs 47.0%), heavy smoking (20.5% vs 16.6%), and male infants (53.4% vs 50.2%). Of the 40,700 infants (89.9%) examined at one year, 1.7% (700) had definite IH and a further 0.6% (230) had suspect IH (Supplementary Table S1). Across centres, any MVM ranged from 9.8% to 80.3%, any AI from 14.5% to 38.1%, and definite IH from 0.4% to 3.6%, with Boston contributing 41.4% (290/700) of IH cases (Supplementary Table S2).</w:t>
       </w:r>
     </w:p>
     <w:p>
@@ -1207,7 +1194,7 @@
           <w:sz w:val="24"/>
           <w:szCs w:val="24"/>
         </w:rPr>
-        <w:t xml:space="preserve">3.2. MVM, AI, and IH</w:t>
+        <w:t xml:space="preserve">3.2. Joint exposure to MVM and AI</w:t>
       </w:r>
     </w:p>
     <w:p>
@@ -1221,7 +1208,7 @@
           <w:sz w:val="24"/>
           <w:szCs w:val="24"/>
         </w:rPr>
-        <w:t xml:space="preserve">IH occurred in 2.0% (225/11,324) of infants with MVM and 1.6% (475/29,376) of those without, and in 2.0% (181/8,880) of infants with AI and 1.6% (519/31,820) of those without (Table 2). In the primary model, neither MVM (RR 1.14, 95% CI 0.96, 1.35) nor AI (RR 1.14, 95% CI 0.96, 1.35) was associated with IH, and neither was the MVM score (per point, RR 1.05, 95% CI 0.97, 1.15) or the AI score (per involved compartment, RR 1.03, 95% CI 0.98, 1.08). In the mutually adjusted model, estimates were unchanged (MVM RR 1.14, 95% CI 0.96, 1.35, and AI RR 1.13, 95% CI 0.96, 1.34) (Supplementary Table S3). In the secondary model without study site, estimates were larger (MVM RR 1.25, 95% CI 1.07, 1.46, and AI RR 1.20, 95% CI 1.02, 1.42).</w:t>
+        <w:t xml:space="preserve">IH risk was higher for infants whose placentas showed both MVM and AI (2.4%, 70/2,895) than for those whose placentas showed neither (1.6%, 364/23,391) (RR 1.37, 95% CI 1.05, 1.78) (Table 2). Estimates for placentas with MVM only or AI only were close to the null (Table 2). The RERI was 0.22 (95% CI −0.20, 0.64), the attributable proportion was 0.16 (95% CI −0.12, 0.44), and the ratio of RRs was 1.18 (95% CI 0.83, 1.68), compatible with, but not establishing, interaction on either scale (Supplementary Table S3).</w:t>
       </w:r>
     </w:p>
     <w:p>
@@ -1239,7 +1226,7 @@
           <w:sz w:val="24"/>
           <w:szCs w:val="24"/>
         </w:rPr>
-        <w:t xml:space="preserve">3.3. Joint exposure to MVM and AI</w:t>
+        <w:t xml:space="preserve">3.3. MVM, AI, and IH</w:t>
       </w:r>
     </w:p>
     <w:p>
@@ -1253,7 +1240,7 @@
           <w:sz w:val="24"/>
           <w:szCs w:val="24"/>
         </w:rPr>
-        <w:t xml:space="preserve">Compared with placentas that had neither MVM nor AI (IH 1.6%, 364/23,391), IH risk was similar for placentas with MVM only (1.8%, RR 1.08, 95% CI 0.89, 1.32) or AI only (1.9%, RR 1.07, 95% CI 0.86, 1.32), and higher for placentas with both (2.4%, 70/2,895, RR 1.37, 95% CI 1.05, 1.78) (Table 2). The RERI was 0.22 (95% CI −0.20, 0.64), the attributable proportion was 0.16 (95% CI −0.12, 0.44), and the ratio of RRs was 1.18 (95% CI 0.83, 1.68). These estimates were compatible with, but did not establish, interaction on either scale (Supplementary Table S4).</w:t>
+        <w:t xml:space="preserve">IH occurred in 2.0% (225/11,324) of infants with MVM and 1.6% (475/29,376) of those without, and in 2.0% (181/8,880) of infants with AI and 1.6% (519/31,820) of those without (Table 2). In the primary model, MVM (RR 1.14, 95% CI 0.96, 1.35) and AI (RR 1.14, 95% CI 0.96, 1.35) were each associated with a small but imprecise increase in IH risk, as were the MVM score (per point, RR 1.05, 95% CI 0.97, 1.15) and the AI score (per involved compartment, RR 1.03, 95% CI 0.98, 1.08). Estimates were unchanged in the mutually adjusted model (Supplementary Table S4) and were larger in the secondary model without study site (MVM RR 1.25, 95% CI 1.07, 1.46, and AI RR 1.20, 95% CI 1.02, 1.42).</w:t>
       </w:r>
     </w:p>
     <w:p>
@@ -1285,35 +1272,7 @@
           <w:sz w:val="24"/>
           <w:szCs w:val="24"/>
         </w:rPr>
-        <w:t xml:space="preserve">IH risk did not increase with lesion severity. Compared with no MVM, the RR was 1.15 (95% CI 0.96, 1.37) for low-grade and 1.09 (95% CI 0.77, 1.55) for high-grade MVM. Compared with no AI, the RR was 1.26 (95% CI 1.02, 1.55) for low-stage and 1.00 (95% CI 0.78, 1.28) for high-stage AI (Supplementary Table S5). By maternal or foetal involvement, RRs were 1.07 (95% CI 0.81, 1.43) for a maternal response only, 1.12 (95% CI 0.86, 1.47) for a foetal response only, and 1.20 (95% CI 0.94, 1.55) for both (Supplementary Table S6).</w:t>
-      </w:r>
-    </w:p>
-    <w:p>
-      <w:pPr>
-        <w:spacing w:after="0" w:before="0" w:line="480"/>
-        <w:ind w:firstLine="480"/>
-      </w:pPr>
-      <w:r>
-        <w:rPr>
-          <w:rFonts w:ascii="Times New Roman" w:cs="Times New Roman" w:eastAsia="Times New Roman" w:hAnsi="Times New Roman"/>
-          <w:sz w:val="24"/>
-          <w:szCs w:val="24"/>
-        </w:rPr>
-        <w:t xml:space="preserve">Adjustment for the 11 covariates changed estimates little, and almost all of the difference between crude and primary estimates arose when study site was added (Supplementary Table S7). Results were similar when study site was modelled as a random effect (MVM RR 1.16, 95% CI 0.98, 1.37, and AI RR 1.15, 95% CI 0.97, 1.36) (Supplementary Table S8). In Boston, the RR was 1.11 (95% CI 0.87, 1.42) for MVM and 1.28 (95% CI 1.00, 1.63) for AI, compared with 1.14 (95% CI 0.90, 1.44) and 1.03 (95% CI 0.82, 1.31) at the other 11 centres (Supplementary Table S9). AI was recorded more often in Boston than elsewhere (27.6% vs 20.9%), whereas MVM prevalence was similar (29.8% vs 28.7%). Foetal-only inflammation, which involved the umbilical vein in 87.8% of cases, had the largest crude estimate of any AI category (RR 1.67, 95% CI 1.29, 2.18), which fell to 1.12 after adjustment for study site. Of the 2,224 placentas with foetal-only inflammation among infants examined at one year, 61.1% (1,359) were from Boston, where this pattern was recorded in 14.1% of placentas compared with 0.9% to 8.1% at the other centres.</w:t>
-      </w:r>
-    </w:p>
-    <w:p>
-      <w:pPr>
-        <w:spacing w:after="0" w:before="0" w:line="480"/>
-        <w:ind w:firstLine="480"/>
-      </w:pPr>
-      <w:r>
-        <w:rPr>
-          <w:rFonts w:ascii="Times New Roman" w:cs="Times New Roman" w:eastAsia="Times New Roman" w:hAnsi="Times New Roman"/>
-          <w:sz w:val="24"/>
-          <w:szCs w:val="24"/>
-        </w:rPr>
-        <w:t xml:space="preserve">When suspect IH was included in the outcome (930 cases), estimates were similar (MVM RR 1.13, 95% CI 0.98, 1.30, and AI RR 1.10, 95% CI 0.95, 1.27) (Supplementary Table S10). Inverse probability weighting changed no estimate by more than 0.01.</w:t>
+        <w:t xml:space="preserve">IH risk did not increase with MVM grade or AI stage (Supplementary Table S5), and estimates were similar for maternal-only, foetal-only, and combined inflammatory responses (Supplementary Table S6). Adjustment for the 11 covariates changed estimates little, whereas adding study site attenuated them (Supplementary Table S7). Results were similar when study site was modelled as a random effect (Supplementary Table S8). Estimates for MVM were similar in Boston and the other 11 centres, whereas the estimate for AI was higher in Boston, where AI was also recorded more often (Supplementary Table S9). Results were also similar when suspect IH was included in the outcome (Supplementary Table S10).</w:t>
       </w:r>
     </w:p>
     <w:p>
@@ -1336,6 +1295,20 @@
     </w:p>
     <w:p>
       <w:pPr>
+        <w:spacing w:after="0" w:before="0" w:line="480"/>
+        <w:ind w:firstLine="480"/>
+      </w:pPr>
+      <w:r>
+        <w:rPr>
+          <w:rFonts w:ascii="Times New Roman" w:cs="Times New Roman" w:eastAsia="Times New Roman" w:hAnsi="Times New Roman"/>
+          <w:sz w:val="24"/>
+          <w:szCs w:val="24"/>
+        </w:rPr>
+        <w:t xml:space="preserve">In this prospective cohort of 45,268 singleton pregnancies, IH risk was higher among infants whose placentas showed both MVM and AI than among those whose placentas showed neither. MVM and AI alone were each associated with small, imprecise increases in IH risk, and risk did not increase with MVM grade or AI stage.</w:t>
+      </w:r>
+    </w:p>
+    <w:p>
+      <w:pPr>
         <w:keepNext/>
         <w:spacing w:after="0" w:before="240" w:line="480"/>
       </w:pPr>
@@ -1349,7 +1322,7 @@
           <w:sz w:val="24"/>
           <w:szCs w:val="24"/>
         </w:rPr>
-        <w:t xml:space="preserve">4.1. Principal findings</w:t>
+        <w:t xml:space="preserve">4.1. Comparison with previous studies</w:t>
       </w:r>
     </w:p>
     <w:p>
@@ -1363,7 +1336,7 @@
           <w:sz w:val="24"/>
           <w:szCs w:val="24"/>
         </w:rPr>
-        <w:t xml:space="preserve">In this prospective cohort of 45,268 singleton pregnancies, neither placental MVM nor AI was associated with IH after accounting for study site. Point estimates were slightly above the null, and the confidence intervals could not exclude a small increase in risk, but they make RRs larger than about 1.35 unlikely for either lesion pattern. IH risk did not increase with MVM grade or AI stage. IH risk was higher when both MVM and AI were present, although the interaction estimate was imprecise. The larger estimates observed without adjustment for study site reflected differences between centres rather than associations within centres.</w:t>
+        <w:t xml:space="preserve">The higher risk of IH with co-occurring MVM and AI is consistent with earlier studies reporting that placental abnormalities were more common in pregnancies affected by IH [7,18]. Among 26 very-low-birthweight infants, extensive infarction or retroplacental haematoma was found in all 13 placentas of infants with IH, with chorioamnionitis or funisitis in some [18]. In a cohort of 594 infants, placental anomalies, largely clinically defined conditions such as pre-eclampsia and placenta praevia, were approximately twice as common in IH-affected pregnancies [7]. Neither study examined the co-occurrence of MVM and AI or adjusted for confounding. The smaller and imprecise associations for MVM or AI alone are consistent with studies of hypertensive disorders of pregnancy, a complication frequently accompanied by MVM [35]. A previous CPP analysis found no clear association between hypertensive disorders of pregnancy and IH [36], and in administrative data the association between pre-eclampsia and IH largely reflected greater surveillance of infants with longer neonatal stays [37]. Together, these findings suggest that a combined placental profile involving both ischaemic and inflammatory injury, rather than either pattern alone, may contribute to the development of a subgroup of IH.</w:t>
       </w:r>
     </w:p>
     <w:p>
@@ -1381,7 +1354,7 @@
           <w:sz w:val="24"/>
           <w:szCs w:val="24"/>
         </w:rPr>
-        <w:t xml:space="preserve">4.2. Study site and placental diagnosis</w:t>
+        <w:t xml:space="preserve">4.2. Biological interpretation</w:t>
       </w:r>
     </w:p>
     <w:p>
@@ -1395,7 +1368,7 @@
           <w:sz w:val="24"/>
           <w:szCs w:val="24"/>
         </w:rPr>
-        <w:t xml:space="preserve">Variation in placental diagnosis across centres is central to interpreting these findings, because the associations seen without adjustment for study site arose largely from comparisons between centres. MVM was recorded in 9.8% of placentas at one CPP centre and 80.3% at another, a range too wide to reflect differences in the populations alone. Because IH prevalence also varied across centres, possibly reflecting differences in populations and in paediatric ascertainment, centre-level differences in diagnostic thresholds can confound the association between a recorded placental lesion and IH. Adjustment for study site compares placentas read within the same centre, and the resulting attenuation (MVM from 1.25 to 1.14, AI from 1.20 to 1.14) is consistent with removal of between-centre confounding. Estimates were similar when site was modelled as a random effect.</w:t>
+        <w:t xml:space="preserve">The higher risk when MVM and AI co-occurred is compatible with a multiple-hit model in which vascular and inflammatory insults converge on foetal angiogenic signalling [2,17]. Placental hypoxia has been proposed as the initiating event in a cascade of intrauterine insults that contribute to IH [11,14]. MVM lesions such as infarction, retroplacental haematoma, and increased perivillous fibrin deposition reduce the transfer of oxygen across the villi and may result in chronic foetal hypoxic stress. Hypoxia and oxidative stress can themselves induce sterile placental inflammation [38], and AI, presenting as chorioamnionitis, funisitis, or chorionic vasculitis, increases inflammatory signalling that may compound hypoxic and ischaemic injury [17]. Consistent with the predominantly postnatal growth of IH, these antenatal placental injuries may prime a susceptible population of endothelial progenitor cells, whereas postnatal hormonal and angiogenic signals determine whether they proliferate [2,3]. Although the biology of MVM and AI is closely interrelated, the statistical interaction estimate in this study was imprecise and compatible with no departure from additivity.</w:t>
       </w:r>
     </w:p>
     <w:p>
@@ -1409,7 +1382,7 @@
           <w:sz w:val="24"/>
           <w:szCs w:val="24"/>
         </w:rPr>
-        <w:t xml:space="preserve">The Boston centre, where one pathologist examined 92.6% of placentas [22], recorded AI more often than other centres, including foetal inflammation without a maternal response, a pattern that should be uncommon because a foetal response ordinarily follows a maternal one [20,35]. This suggests a lower diagnostic threshold, and shows that consistency within a single reader does not ensure comparability with other readers. Multicentre placental studies should therefore account for centre and, where possible, reader.</w:t>
+        <w:t xml:space="preserve">The small and imprecise relative risks for individual placental pathologies suggest that placental injury is only one aspect of the complex developmental pathology of IH. In some cases, MVM or AI alone may be sufficient to modestly increase the probability of endothelial progenitor cell proliferation.</w:t>
       </w:r>
     </w:p>
     <w:p>
@@ -1427,7 +1400,7 @@
           <w:sz w:val="24"/>
           <w:szCs w:val="24"/>
         </w:rPr>
-        <w:t xml:space="preserve">4.3. Comparison with previous studies</w:t>
+        <w:t xml:space="preserve">4.3. Strengths and limitations</w:t>
       </w:r>
     </w:p>
     <w:p>
@@ -1441,7 +1414,21 @@
           <w:sz w:val="24"/>
           <w:szCs w:val="24"/>
         </w:rPr>
-        <w:t xml:space="preserve">Earlier studies reported that placental anomalies were more common in pregnancies affected by IH [7,18]. These studies were small, used composite or selected exposures, and did not adjust for confounding, and the present estimates are considerably smaller. The findings are also consistent with a previous CPP analysis that found no clear association between hypertensive disorders of pregnancy and IH [36]. This may reflect that clinically defined hypertensive disorders are not consistently accompanied by MVM [37]. The findings also agree with evidence that the association between pre-eclampsia and IH in administrative data largely reflects greater surveillance of infants with longer neonatal stays [38]. Together, these studies suggest that placental vascular injury is not a major determinant of IH, and that any contribution is likely to be small.</w:t>
+        <w:t xml:space="preserve">Strengths of this study include its prospective design, in which placentas were examined at delivery before any infant outcome was known, and the standardised paediatrician examination of all surviving infants regardless of exposure, which avoids the referral and surveillance biases of clinic-based and administrative studies. More than 45,000 placentas were examined under a common protocol, making this the largest study of placental histopathology and IH and the first to examine co-occurring MVM and AI. The analysis addressed confounding by centre, missing covariate data, selection due to death and loss to follow-up, and clustering of siblings.</w:t>
+      </w:r>
+    </w:p>
+    <w:p>
+      <w:pPr>
+        <w:spacing w:after="0" w:before="0" w:line="480"/>
+        <w:ind w:firstLine="480"/>
+      </w:pPr>
+      <w:r>
+        <w:rPr>
+          <w:rFonts w:ascii="Times New Roman" w:cs="Times New Roman" w:eastAsia="Times New Roman" w:hAnsi="Times New Roman"/>
+          <w:sz w:val="24"/>
+          <w:szCs w:val="24"/>
+        </w:rPr>
+        <w:t xml:space="preserve">Several limitations should be considered. First, despite the size of the cohort, IH is uncommon, and the study had limited power to detect small associations or interaction. Second, the CPP predates the Amsterdam consensus, and four lesions in the current MVM definition were not recorded [25]. Third, diagnostic thresholds varied widely across centres (e.g., MVM was recorded in 9.8% to 80.3% of placentas), which confounded estimates before adjustment for study site, and both random and centre-specific exposure misclassification are likely. Fourth, IH was ascertained at a single examination at 12 months. Most IH reach their maximum size by five months of age and remain visible at one year [3], but small or involuting lesions may have been missed, and the diagnostic categories of the 1960s predate the modern classification of vascular anomalies. Outcome misclassification unrelated to placental pathology would most likely attenuate associations. Fifth, AI generally reflects an inflammatory process close to delivery, and an effect on IH would require a systemic foetal inflammatory response with lasting consequences [39]. Finally, residual confounding is possible, including by maternal history of angioma, an established risk factor that was not recorded [40].</w:t>
       </w:r>
     </w:p>
     <w:p>
@@ -1459,7 +1446,7 @@
           <w:sz w:val="24"/>
           <w:szCs w:val="24"/>
         </w:rPr>
-        <w:t xml:space="preserve">4.4. Biological interpretation</w:t>
+        <w:t xml:space="preserve">4.4. Future directions</w:t>
       </w:r>
     </w:p>
     <w:p>
@@ -1473,113 +1460,7 @@
           <w:sz w:val="24"/>
           <w:szCs w:val="24"/>
         </w:rPr>
-        <w:t xml:space="preserve">The hypoxia hypothesis offers a plausible framework for a link between MVM and IH. IH shares markers and transcriptional programmes with placental tissue [9,10], and hypoxia-induced mediators of progenitor cell mobilisation are elevated in children with IH [11,14]. However, this evidence demonstrates a shared or hypoxia-responsive phenotype within established lesions rather than a causal effect of placental malperfusion, and genetic studies have not supported a maternal origin of IH cells [39]. The null finding for MVM does not refute the hypothesis, because a small effect cannot be excluded, but it provides no support for a strong link. The absence of a gradient by MVM grade argues against a strong effect, although incomplete capture of MVM lesions and misclassification would attenuate a true gradient. One possibility, consistent with the predominantly postnatal growth of IH, is that antenatal placental injury expands a susceptible population of endothelial progenitor cells, whereas postnatal hormonal and angiogenic signals determine whether it proliferates [2,3]. This two-stage model has not been tested prospectively.</w:t>
-      </w:r>
-    </w:p>
-    <w:p>
-      <w:pPr>
-        <w:spacing w:after="0" w:before="0" w:line="480"/>
-        <w:ind w:firstLine="480"/>
-      </w:pPr>
-      <w:r>
-        <w:rPr>
-          <w:rFonts w:ascii="Times New Roman" w:cs="Times New Roman" w:eastAsia="Times New Roman" w:hAnsi="Times New Roman"/>
-          <w:sz w:val="24"/>
-          <w:szCs w:val="24"/>
-        </w:rPr>
-        <w:t xml:space="preserve">AI is a less plausible cause of IH. Histological AI generally reflects an inflammatory process close to delivery, often of infectious origin, and a direct effect on localised skin angiogenesis would require a systemic foetal inflammatory response with lasting consequences [17,35]. The higher estimate for low-stage than high-stage AI, the absence of a clear gradient from maternal to foetal involvement, and the centre-specific pattern of foetal-only inflammation all argue against a causal interpretation. For retinopathy of prematurity, another postnatal disorder of angiogenesis, the association with chorioamnionitis is largely explained by lower gestational age [40], and AI may similarly mark pathways to preterm birth rather than act on IH directly.</w:t>
-      </w:r>
-    </w:p>
-    <w:p>
-      <w:pPr>
-        <w:spacing w:after="0" w:before="0" w:line="480"/>
-        <w:ind w:firstLine="480"/>
-      </w:pPr>
-      <w:r>
-        <w:rPr>
-          <w:rFonts w:ascii="Times New Roman" w:cs="Times New Roman" w:eastAsia="Times New Roman" w:hAnsi="Times New Roman"/>
-          <w:sz w:val="24"/>
-          <w:szCs w:val="24"/>
-        </w:rPr>
-        <w:t xml:space="preserve">The higher risk when MVM and AI co-occurred is compatible with a multiple-hit model in which vascular and inflammatory insults converge on foetal angiogenic signalling [2,17]. However, the interaction estimate was imprecise and compatible with no departure from additivity, neither lesion showed a dose-response, and the joint category was one of several related contrasts. This finding should therefore be regarded as hypothesis-generating.</w:t>
-      </w:r>
-    </w:p>
-    <w:p>
-      <w:pPr>
-        <w:keepNext/>
-        <w:spacing w:after="0" w:before="240" w:line="480"/>
-      </w:pPr>
-      <w:r>
-        <w:rPr>
-          <w:rFonts w:ascii="Times New Roman" w:cs="Times New Roman" w:eastAsia="Times New Roman" w:hAnsi="Times New Roman"/>
-          <w:b/>
-          <w:bCs/>
-          <w:i/>
-          <w:iCs/>
-          <w:sz w:val="24"/>
-          <w:szCs w:val="24"/>
-        </w:rPr>
-        <w:t xml:space="preserve">4.5. Strengths and limitations</w:t>
-      </w:r>
-    </w:p>
-    <w:p>
-      <w:pPr>
-        <w:spacing w:after="0" w:before="0" w:line="480"/>
-        <w:ind w:firstLine="480"/>
-      </w:pPr>
-      <w:r>
-        <w:rPr>
-          <w:rFonts w:ascii="Times New Roman" w:cs="Times New Roman" w:eastAsia="Times New Roman" w:hAnsi="Times New Roman"/>
-          <w:sz w:val="24"/>
-          <w:szCs w:val="24"/>
-        </w:rPr>
-        <w:t xml:space="preserve">Strengths of this study include its prospective design, in which placentas were examined at delivery before any infant outcome was known, and the standardised paediatrician examination of all surviving infants regardless of exposure, which avoids the referral and surveillance biases of clinic-based and administrative studies. More than 45,000 placentas were examined under a common protocol. The analysis addressed confounding by centre, missing covariate data, selection due to death and loss to follow-up, and clustering of siblings.</w:t>
-      </w:r>
-    </w:p>
-    <w:p>
-      <w:pPr>
-        <w:spacing w:after="0" w:before="0" w:line="480"/>
-        <w:ind w:firstLine="480"/>
-      </w:pPr>
-      <w:r>
-        <w:rPr>
-          <w:rFonts w:ascii="Times New Roman" w:cs="Times New Roman" w:eastAsia="Times New Roman" w:hAnsi="Times New Roman"/>
-          <w:sz w:val="24"/>
-          <w:szCs w:val="24"/>
-        </w:rPr>
-        <w:t xml:space="preserve">Several limitations should be considered. First, despite the size of the cohort, IH is uncommon, and the study had limited power to detect small associations. Power to detect the observed RR of 1.14 was approximately 36% for MVM and 32% for AI, so small effects cannot be excluded. Second, the CPP predates the Amsterdam consensus, four lesions in the current MVM definition were not recorded [25], and both random and centre-specific exposure misclassification are likely. Third, IH was ascertained at a single examination at 12 months. Most IH reach their maximum size by five months of age and remain visible at one year [3], but small or involuting lesions may have been missed, and the diagnostic categories of the 1960s predate the modern classification of vascular anomalies. Outcome misclassification unrelated to placental pathology would most likely attenuate associations. Fourth, differences in IH ascertainment across centres may not be fully captured by adjustment for site. Fifth, residual confounding is possible, including by maternal history of angioma, an established risk factor that was not recorded [41]. Finally, gestational age and birthweight were not adjusted for because they may mediate effects of placental pathology [26], so estimates represent total effects.</w:t>
-      </w:r>
-    </w:p>
-    <w:p>
-      <w:pPr>
-        <w:keepNext/>
-        <w:spacing w:after="0" w:before="240" w:line="480"/>
-      </w:pPr>
-      <w:r>
-        <w:rPr>
-          <w:rFonts w:ascii="Times New Roman" w:cs="Times New Roman" w:eastAsia="Times New Roman" w:hAnsi="Times New Roman"/>
-          <w:b/>
-          <w:bCs/>
-          <w:i/>
-          <w:iCs/>
-          <w:sz w:val="24"/>
-          <w:szCs w:val="24"/>
-        </w:rPr>
-        <w:t xml:space="preserve">4.6. Future directions</w:t>
-      </w:r>
-    </w:p>
-    <w:p>
-      <w:pPr>
-        <w:spacing w:after="0" w:before="0" w:line="480"/>
-        <w:ind w:firstLine="480"/>
-      </w:pPr>
-      <w:r>
-        <w:rPr>
-          <w:rFonts w:ascii="Times New Roman" w:cs="Times New Roman" w:eastAsia="Times New Roman" w:hAnsi="Times New Roman"/>
-          <w:sz w:val="24"/>
-          <w:szCs w:val="24"/>
-        </w:rPr>
-        <w:t xml:space="preserve">Future studies should examine placental pathology with central, blinded review using current Amsterdam definitions, duplicate reading of a calibration subset, and recorded pathologist identity. Linking placental lesions to cord-blood markers of foetal inflammation and hypoxia, and to serial dermatological examinations during the first months of life, would distinguish maternal from foetal effects and capture both the occurrence and growth of IH. Prespecified analyses of MVM and AI interaction, and formal mediation analyses through preterm birth and foetal growth, would clarify whether combined placental injury contributes to IH. Whether IH is associated with perinatal infection, which often underlies acute placental inflammation, also warrants study. Modifiable upstream determinants of placental injury, such as maternal diet, environmental exposures, and hypertensive disorders, are a research priority, although evidence linking these exposures to IH through placental pathology is currently lacking.</w:t>
+        <w:t xml:space="preserve">Confirming these findings would require a considerably larger cohort with systematic placental examination, which is difficult because placentas are rarely sent for pathological examination without a clinical indication. Future studies should also link placental lesions to cord-blood markers of foetal inflammation and hypoxia, and to serial dermatological examinations during the first months of life, which may distinguish maternal from foetal effects and capture both the occurrence and growth of IH. Formal mediation analyses through preterm birth and foetal growth would clarify whether any effect of placental injury on IH operates through these pathways. Modifiable upstream determinants of placental injury, such as maternal diet, environmental exposures, and hypertensive disorders, are a research priority.</w:t>
       </w:r>
     </w:p>
     <w:p>
@@ -1611,7 +1492,7 @@
           <w:sz w:val="24"/>
           <w:szCs w:val="24"/>
         </w:rPr>
-        <w:t xml:space="preserve">In this large prospective cohort, neither placental MVM nor AI was associated with IH after accounting for study site, although IH risk was higher when both were present. Variation in placental diagnosis across centres strongly influenced the estimates, underscoring the importance of accounting for centre and, where possible, pathologist in multicentre placental research. Larger studies with centralised placental review are needed to determine whether combined placental injury contributes to IH.</w:t>
+        <w:t xml:space="preserve">In this large prospective cohort, placentas with both MVM and AI carried a higher risk of IH, suggesting that chronic malperfusion and acute inflammation closer to delivery may act together in the development of IH. MVM and AI alone were associated with small, imprecise increases in risk. These findings support further study of combined placental injury in the developmental origins of IH.</w:t>
       </w:r>
     </w:p>
     <w:p>
@@ -2305,7 +2186,7 @@
           <w:sz w:val="24"/>
           <w:szCs w:val="24"/>
         </w:rPr>
-        <w:t xml:space="preserve">[35] F. Gotsch, R. Romero, J.P. Kusanovic, et al., The fetal inflammatory response syndrome, Clin. Obstet. Gynecol. 50 (2007) 652-683. https://doi.org/10.1097/GRF.0b013e31811ebef6</w:t>
+        <w:t xml:space="preserve">[35] A.A. Freedman, et al., Patterns of placental pathology associated with preeclampsia, Placenta (2023). PMID: 37336159 [FLAG: add co-authors, volume, pages, and DOI]</w:t>
       </w:r>
     </w:p>
     <w:p>
@@ -2333,7 +2214,7 @@
           <w:sz w:val="24"/>
           <w:szCs w:val="24"/>
         </w:rPr>
-        <w:t xml:space="preserve">[37] A.A. Freedman, et al., Patterns of placental pathology associated with preeclampsia, Placenta (2023). PMID: 37336159 [FLAG: add co-authors, volume, pages, and DOI]</w:t>
+        <w:t xml:space="preserve">[37] N. Auger, W.D. Fraser, L. Arbour, et al., Pre-eclampsia and risk of infantile haemangioma, Br. J. Dermatol. 176 (2017) 371-377. https://doi.org/10.1111/bjd.14958</w:t>
       </w:r>
     </w:p>
     <w:p>
@@ -2347,7 +2228,7 @@
           <w:sz w:val="24"/>
           <w:szCs w:val="24"/>
         </w:rPr>
-        <w:t xml:space="preserve">[38] N. Auger, W.D. Fraser, L. Arbour, et al., Pre-eclampsia and risk of infantile haemangioma, Br. J. Dermatol. 176 (2017) 371-377. https://doi.org/10.1111/bjd.14958</w:t>
+        <w:t xml:space="preserve">[38] B.C. Baker, A.E.P. Heazell, C. Sibley, et al., Hypoxia and oxidative stress induce sterile placental inflammation in vitro, Sci. Rep. 11 (2021). https://doi.org/10.1038/s41598-021-86268-1 [FLAG: add article number]</w:t>
       </w:r>
     </w:p>
     <w:p>
@@ -2361,7 +2242,7 @@
           <w:sz w:val="24"/>
           <w:szCs w:val="24"/>
         </w:rPr>
-        <w:t xml:space="preserve">[39] K.M. Pittman, H.W. Losken, M.E. Kleinman, et al., No evidence for maternal-fetal microchimerism in infantile hemangioma: a molecular genetic investigation, J. Invest. Dermatol. 126 (2006) 2533-2538. https://doi.org/10.1038/sj.jid.5700516</w:t>
+        <w:t xml:space="preserve">[39] F. Gotsch, R. Romero, J.P. Kusanovic, et al., The fetal inflammatory response syndrome, Clin. Obstet. Gynecol. 50 (2007) 652-683. https://doi.org/10.1097/GRF.0b013e31811ebef6</w:t>
       </w:r>
     </w:p>
     <w:p>
@@ -2375,21 +2256,7 @@
           <w:sz w:val="24"/>
           <w:szCs w:val="24"/>
         </w:rPr>
-        <w:t xml:space="preserve">[40] E. Villamor-Martinez, et al., Chorioamnionitis as a risk factor for retinopathy of prematurity: an updated systematic review and meta-analysis, PLoS One 13 (2018) e0205838. https://doi.org/10.1371/journal.pone.0205838 [FLAG: add co-authors]</w:t>
-      </w:r>
-    </w:p>
-    <w:p>
-      <w:pPr>
-        <w:spacing w:after="0" w:before="0" w:line="360"/>
-        <w:ind w:left="480" w:hanging="480"/>
-      </w:pPr>
-      <w:r>
-        <w:rPr>
-          <w:rFonts w:ascii="Times New Roman" w:cs="Times New Roman" w:eastAsia="Times New Roman" w:hAnsi="Times New Roman"/>
-          <w:sz w:val="24"/>
-          <w:szCs w:val="24"/>
-        </w:rPr>
-        <w:t xml:space="preserve">[41] Z.C. Chiesa Fuxench, N. Mitra, J. Wong, O. Hoffstad, S. Hinkle, D.J. Margolis, Maternal history of angioma is associated with infantile hemangioma and port-wine stain in children: a population-based, cohort study of mother-child pairs from the United Kingdom, Arch. Dermatol. Res. 316 (2024) 506. https://doi.org/10.1007/s00403-024-03247-y</w:t>
+        <w:t xml:space="preserve">[40] Z.C. Chiesa Fuxench, N. Mitra, J. Wong, O. Hoffstad, S. Hinkle, D.J. Margolis, Maternal history of angioma is associated with infantile hemangioma and port-wine stain in children: a population-based, cohort study of mother-child pairs from the United Kingdom, Arch. Dermatol. Res. 316 (2024) 506. https://doi.org/10.1007/s00403-024-03247-y</w:t>
       </w:r>
     </w:p>
     <w:p>
@@ -16334,7 +16201,7 @@
                 <w:sz w:val="16"/>
                 <w:szCs w:val="16"/>
               </w:rPr>
-              <w:t xml:space="preserve">Maternal vascular malperfusion</w:t>
+              <w:t xml:space="preserve">Joint MVM and AI</w:t>
             </w:r>
           </w:p>
         </w:tc>
@@ -16505,7 +16372,7 @@
                 <w:sz w:val="16"/>
                 <w:szCs w:val="16"/>
               </w:rPr>
-              <w:t xml:space="preserve">None</w:t>
+              <w:t xml:space="preserve">Neither</w:t>
             </w:r>
           </w:p>
         </w:tc>
@@ -16538,7 +16405,7 @@
                 <w:sz w:val="16"/>
                 <w:szCs w:val="16"/>
               </w:rPr>
-              <w:t xml:space="preserve">1.6% (475/29,376)</w:t>
+              <w:t xml:space="preserve">1.6% (364/23,391)</w:t>
             </w:r>
           </w:p>
         </w:tc>
@@ -16676,7 +16543,7 @@
                 <w:sz w:val="16"/>
                 <w:szCs w:val="16"/>
               </w:rPr>
-              <w:t xml:space="preserve">Any</w:t>
+              <w:t xml:space="preserve">MVM only</w:t>
             </w:r>
           </w:p>
         </w:tc>
@@ -16709,7 +16576,7 @@
                 <w:sz w:val="16"/>
                 <w:szCs w:val="16"/>
               </w:rPr>
-              <w:t xml:space="preserve">2.0% (225/11,324)</w:t>
+              <w:t xml:space="preserve">1.8% (155/8,429)</w:t>
             </w:r>
           </w:p>
         </w:tc>
@@ -16742,7 +16609,7 @@
                 <w:sz w:val="16"/>
                 <w:szCs w:val="16"/>
               </w:rPr>
-              <w:t xml:space="preserve">1.22 (1.05, 1.43)</w:t>
+              <w:t xml:space="preserve">1.18 (0.98, 1.42)</w:t>
             </w:r>
           </w:p>
         </w:tc>
@@ -16775,7 +16642,7 @@
                 <w:sz w:val="16"/>
                 <w:szCs w:val="16"/>
               </w:rPr>
-              <w:t xml:space="preserve">1.14 (0.96, 1.35)</w:t>
+              <w:t xml:space="preserve">1.08 (0.89, 1.32)</w:t>
             </w:r>
           </w:p>
         </w:tc>
@@ -16808,7 +16675,7 @@
                 <w:sz w:val="16"/>
                 <w:szCs w:val="16"/>
               </w:rPr>
-              <w:t xml:space="preserve">1.25 (1.07, 1.46)</w:t>
+              <w:t xml:space="preserve">1.18 (0.98, 1.42)</w:t>
             </w:r>
           </w:p>
         </w:tc>
@@ -16847,7 +16714,7 @@
                 <w:sz w:val="16"/>
                 <w:szCs w:val="16"/>
               </w:rPr>
-              <w:t xml:space="preserve">Score, per 1 point</w:t>
+              <w:t xml:space="preserve">AI only</w:t>
             </w:r>
           </w:p>
         </w:tc>
@@ -16880,7 +16747,7 @@
                 <w:sz w:val="16"/>
                 <w:szCs w:val="16"/>
               </w:rPr>
-              <w:t xml:space="preserve"/>
+              <w:t xml:space="preserve">1.9% (111/5,985)</w:t>
             </w:r>
           </w:p>
         </w:tc>
@@ -16913,7 +16780,7 @@
                 <w:sz w:val="16"/>
                 <w:szCs w:val="16"/>
               </w:rPr>
-              <w:t xml:space="preserve">1.09 (1.01, 1.18)</w:t>
+              <w:t xml:space="preserve">1.19 (0.96, 1.47)</w:t>
             </w:r>
           </w:p>
         </w:tc>
@@ -16946,7 +16813,7 @@
                 <w:sz w:val="16"/>
                 <w:szCs w:val="16"/>
               </w:rPr>
-              <w:t xml:space="preserve">1.05 (0.97, 1.15)</w:t>
+              <w:t xml:space="preserve">1.07 (0.86, 1.32)</w:t>
             </w:r>
           </w:p>
         </w:tc>
@@ -16979,7 +16846,7 @@
                 <w:sz w:val="16"/>
                 <w:szCs w:val="16"/>
               </w:rPr>
-              <w:t xml:space="preserve">1.12 (1.03, 1.21)</w:t>
+              <w:t xml:space="preserve">1.11 (0.90, 1.37)</w:t>
             </w:r>
           </w:p>
         </w:tc>
@@ -17007,17 +16874,18 @@
           <w:p>
             <w:pPr>
               <w:spacing w:line="240"/>
+              <w:ind w:left="200"/>
               <w:jc w:val="left"/>
             </w:pPr>
             <w:r>
               <w:rPr>
                 <w:rFonts w:ascii="Times New Roman" w:cs="Times New Roman" w:eastAsia="Times New Roman" w:hAnsi="Times New Roman"/>
-                <w:b/>
-                <w:bCs/>
-                <w:sz w:val="16"/>
-                <w:szCs w:val="16"/>
-              </w:rPr>
-              <w:t xml:space="preserve">Acute inflammation</w:t>
+                <w:b w:val="false"/>
+                <w:bCs w:val="false"/>
+                <w:sz w:val="16"/>
+                <w:szCs w:val="16"/>
+              </w:rPr>
+              <w:t xml:space="preserve">Both MVM and AI</w:t>
             </w:r>
           </w:p>
         </w:tc>
@@ -17050,7 +16918,7 @@
                 <w:sz w:val="16"/>
                 <w:szCs w:val="16"/>
               </w:rPr>
-              <w:t xml:space="preserve"/>
+              <w:t xml:space="preserve">2.4% (70/2,895)</w:t>
             </w:r>
           </w:p>
         </w:tc>
@@ -17083,7 +16951,7 @@
                 <w:sz w:val="16"/>
                 <w:szCs w:val="16"/>
               </w:rPr>
-              <w:t xml:space="preserve"/>
+              <w:t xml:space="preserve">1.55 (1.20, 1.99)</w:t>
             </w:r>
           </w:p>
         </w:tc>
@@ -17116,7 +16984,7 @@
                 <w:sz w:val="16"/>
                 <w:szCs w:val="16"/>
               </w:rPr>
-              <w:t xml:space="preserve"/>
+              <w:t xml:space="preserve">1.37 (1.05, 1.78)</w:t>
             </w:r>
           </w:p>
         </w:tc>
@@ -17149,7 +17017,7 @@
                 <w:sz w:val="16"/>
                 <w:szCs w:val="16"/>
               </w:rPr>
-              <w:t xml:space="preserve"/>
+              <w:t xml:space="preserve">1.57 (1.22, 2.02)</w:t>
             </w:r>
           </w:p>
         </w:tc>
@@ -17177,18 +17045,17 @@
           <w:p>
             <w:pPr>
               <w:spacing w:line="240"/>
-              <w:ind w:left="200"/>
               <w:jc w:val="left"/>
             </w:pPr>
             <w:r>
               <w:rPr>
                 <w:rFonts w:ascii="Times New Roman" w:cs="Times New Roman" w:eastAsia="Times New Roman" w:hAnsi="Times New Roman"/>
-                <w:b w:val="false"/>
-                <w:bCs w:val="false"/>
-                <w:sz w:val="16"/>
-                <w:szCs w:val="16"/>
-              </w:rPr>
-              <w:t xml:space="preserve">None</w:t>
+                <w:b/>
+                <w:bCs/>
+                <w:sz w:val="16"/>
+                <w:szCs w:val="16"/>
+              </w:rPr>
+              <w:t xml:space="preserve">Maternal vascular malperfusion</w:t>
             </w:r>
           </w:p>
         </w:tc>
@@ -17221,7 +17088,7 @@
                 <w:sz w:val="16"/>
                 <w:szCs w:val="16"/>
               </w:rPr>
-              <w:t xml:space="preserve">1.6% (519/31,820)</w:t>
+              <w:t xml:space="preserve"/>
             </w:r>
           </w:p>
         </w:tc>
@@ -17254,7 +17121,7 @@
                 <w:sz w:val="16"/>
                 <w:szCs w:val="16"/>
               </w:rPr>
-              <w:t xml:space="preserve">1 REF</w:t>
+              <w:t xml:space="preserve"/>
             </w:r>
           </w:p>
         </w:tc>
@@ -17287,7 +17154,7 @@
                 <w:sz w:val="16"/>
                 <w:szCs w:val="16"/>
               </w:rPr>
-              <w:t xml:space="preserve">1 REF</w:t>
+              <w:t xml:space="preserve"/>
             </w:r>
           </w:p>
         </w:tc>
@@ -17320,7 +17187,7 @@
                 <w:sz w:val="16"/>
                 <w:szCs w:val="16"/>
               </w:rPr>
-              <w:t xml:space="preserve">1 REF</w:t>
+              <w:t xml:space="preserve"/>
             </w:r>
           </w:p>
         </w:tc>
@@ -17359,7 +17226,7 @@
                 <w:sz w:val="16"/>
                 <w:szCs w:val="16"/>
               </w:rPr>
-              <w:t xml:space="preserve">Any</w:t>
+              <w:t xml:space="preserve">None</w:t>
             </w:r>
           </w:p>
         </w:tc>
@@ -17392,7 +17259,7 @@
                 <w:sz w:val="16"/>
                 <w:szCs w:val="16"/>
               </w:rPr>
-              <w:t xml:space="preserve">2.0% (181/8,880)</w:t>
+              <w:t xml:space="preserve">1.6% (475/29,376)</w:t>
             </w:r>
           </w:p>
         </w:tc>
@@ -17425,7 +17292,7 @@
                 <w:sz w:val="16"/>
                 <w:szCs w:val="16"/>
               </w:rPr>
-              <w:t xml:space="preserve">1.25 (1.06, 1.47)</w:t>
+              <w:t xml:space="preserve">1 REF</w:t>
             </w:r>
           </w:p>
         </w:tc>
@@ -17458,7 +17325,7 @@
                 <w:sz w:val="16"/>
                 <w:szCs w:val="16"/>
               </w:rPr>
-              <w:t xml:space="preserve">1.14 (0.96, 1.35)</w:t>
+              <w:t xml:space="preserve">1 REF</w:t>
             </w:r>
           </w:p>
         </w:tc>
@@ -17491,7 +17358,7 @@
                 <w:sz w:val="16"/>
                 <w:szCs w:val="16"/>
               </w:rPr>
-              <w:t xml:space="preserve">1.20 (1.02, 1.42)</w:t>
+              <w:t xml:space="preserve">1 REF</w:t>
             </w:r>
           </w:p>
         </w:tc>
@@ -17530,7 +17397,7 @@
                 <w:sz w:val="16"/>
                 <w:szCs w:val="16"/>
               </w:rPr>
-              <w:t xml:space="preserve">Score, per 1 compartment</w:t>
+              <w:t xml:space="preserve">Any</w:t>
             </w:r>
           </w:p>
         </w:tc>
@@ -17563,7 +17430,7 @@
                 <w:sz w:val="16"/>
                 <w:szCs w:val="16"/>
               </w:rPr>
-              <w:t xml:space="preserve"/>
+              <w:t xml:space="preserve">2.0% (225/11,324)</w:t>
             </w:r>
           </w:p>
         </w:tc>
@@ -17596,7 +17463,7 @@
                 <w:sz w:val="16"/>
                 <w:szCs w:val="16"/>
               </w:rPr>
-              <w:t xml:space="preserve">1.03 (0.98, 1.09)</w:t>
+              <w:t xml:space="preserve">1.22 (1.05, 1.43)</w:t>
             </w:r>
           </w:p>
         </w:tc>
@@ -17629,7 +17496,7 @@
                 <w:sz w:val="16"/>
                 <w:szCs w:val="16"/>
               </w:rPr>
-              <w:t xml:space="preserve">1.03 (0.98, 1.08)</w:t>
+              <w:t xml:space="preserve">1.14 (0.96, 1.35)</w:t>
             </w:r>
           </w:p>
         </w:tc>
@@ -17662,7 +17529,7 @@
                 <w:sz w:val="16"/>
                 <w:szCs w:val="16"/>
               </w:rPr>
-              <w:t xml:space="preserve">1.04 (0.99, 1.09)</w:t>
+              <w:t xml:space="preserve">1.25 (1.07, 1.46)</w:t>
             </w:r>
           </w:p>
         </w:tc>
@@ -17690,17 +17557,18 @@
           <w:p>
             <w:pPr>
               <w:spacing w:line="240"/>
+              <w:ind w:left="200"/>
               <w:jc w:val="left"/>
             </w:pPr>
             <w:r>
               <w:rPr>
                 <w:rFonts w:ascii="Times New Roman" w:cs="Times New Roman" w:eastAsia="Times New Roman" w:hAnsi="Times New Roman"/>
-                <w:b/>
-                <w:bCs/>
-                <w:sz w:val="16"/>
-                <w:szCs w:val="16"/>
-              </w:rPr>
-              <w:t xml:space="preserve">Joint MVM and AI</w:t>
+                <w:b w:val="false"/>
+                <w:bCs w:val="false"/>
+                <w:sz w:val="16"/>
+                <w:szCs w:val="16"/>
+              </w:rPr>
+              <w:t xml:space="preserve">Score, per 1 point</w:t>
             </w:r>
           </w:p>
         </w:tc>
@@ -17766,7 +17634,7 @@
                 <w:sz w:val="16"/>
                 <w:szCs w:val="16"/>
               </w:rPr>
-              <w:t xml:space="preserve"/>
+              <w:t xml:space="preserve">1.09 (1.01, 1.18)</w:t>
             </w:r>
           </w:p>
         </w:tc>
@@ -17799,7 +17667,7 @@
                 <w:sz w:val="16"/>
                 <w:szCs w:val="16"/>
               </w:rPr>
-              <w:t xml:space="preserve"/>
+              <w:t xml:space="preserve">1.05 (0.97, 1.15)</w:t>
             </w:r>
           </w:p>
         </w:tc>
@@ -17832,7 +17700,7 @@
                 <w:sz w:val="16"/>
                 <w:szCs w:val="16"/>
               </w:rPr>
-              <w:t xml:space="preserve"/>
+              <w:t xml:space="preserve">1.12 (1.03, 1.21)</w:t>
             </w:r>
           </w:p>
         </w:tc>
@@ -17860,18 +17728,17 @@
           <w:p>
             <w:pPr>
               <w:spacing w:line="240"/>
-              <w:ind w:left="200"/>
               <w:jc w:val="left"/>
             </w:pPr>
             <w:r>
               <w:rPr>
                 <w:rFonts w:ascii="Times New Roman" w:cs="Times New Roman" w:eastAsia="Times New Roman" w:hAnsi="Times New Roman"/>
-                <w:b w:val="false"/>
-                <w:bCs w:val="false"/>
-                <w:sz w:val="16"/>
-                <w:szCs w:val="16"/>
-              </w:rPr>
-              <w:t xml:space="preserve">Neither</w:t>
+                <w:b/>
+                <w:bCs/>
+                <w:sz w:val="16"/>
+                <w:szCs w:val="16"/>
+              </w:rPr>
+              <w:t xml:space="preserve">Acute inflammation</w:t>
             </w:r>
           </w:p>
         </w:tc>
@@ -17904,7 +17771,7 @@
                 <w:sz w:val="16"/>
                 <w:szCs w:val="16"/>
               </w:rPr>
-              <w:t xml:space="preserve">1.6% (364/23,391)</w:t>
+              <w:t xml:space="preserve"/>
             </w:r>
           </w:p>
         </w:tc>
@@ -17937,7 +17804,7 @@
                 <w:sz w:val="16"/>
                 <w:szCs w:val="16"/>
               </w:rPr>
-              <w:t xml:space="preserve">1 REF</w:t>
+              <w:t xml:space="preserve"/>
             </w:r>
           </w:p>
         </w:tc>
@@ -17970,7 +17837,7 @@
                 <w:sz w:val="16"/>
                 <w:szCs w:val="16"/>
               </w:rPr>
-              <w:t xml:space="preserve">1 REF</w:t>
+              <w:t xml:space="preserve"/>
             </w:r>
           </w:p>
         </w:tc>
@@ -18003,7 +17870,7 @@
                 <w:sz w:val="16"/>
                 <w:szCs w:val="16"/>
               </w:rPr>
-              <w:t xml:space="preserve">1 REF</w:t>
+              <w:t xml:space="preserve"/>
             </w:r>
           </w:p>
         </w:tc>
@@ -18042,7 +17909,7 @@
                 <w:sz w:val="16"/>
                 <w:szCs w:val="16"/>
               </w:rPr>
-              <w:t xml:space="preserve">MVM only</w:t>
+              <w:t xml:space="preserve">None</w:t>
             </w:r>
           </w:p>
         </w:tc>
@@ -18075,7 +17942,7 @@
                 <w:sz w:val="16"/>
                 <w:szCs w:val="16"/>
               </w:rPr>
-              <w:t xml:space="preserve">1.8% (155/8,429)</w:t>
+              <w:t xml:space="preserve">1.6% (519/31,820)</w:t>
             </w:r>
           </w:p>
         </w:tc>
@@ -18108,7 +17975,7 @@
                 <w:sz w:val="16"/>
                 <w:szCs w:val="16"/>
               </w:rPr>
-              <w:t xml:space="preserve">1.18 (0.98, 1.42)</w:t>
+              <w:t xml:space="preserve">1 REF</w:t>
             </w:r>
           </w:p>
         </w:tc>
@@ -18141,7 +18008,7 @@
                 <w:sz w:val="16"/>
                 <w:szCs w:val="16"/>
               </w:rPr>
-              <w:t xml:space="preserve">1.08 (0.89, 1.32)</w:t>
+              <w:t xml:space="preserve">1 REF</w:t>
             </w:r>
           </w:p>
         </w:tc>
@@ -18174,7 +18041,7 @@
                 <w:sz w:val="16"/>
                 <w:szCs w:val="16"/>
               </w:rPr>
-              <w:t xml:space="preserve">1.18 (0.98, 1.42)</w:t>
+              <w:t xml:space="preserve">1 REF</w:t>
             </w:r>
           </w:p>
         </w:tc>
@@ -18213,7 +18080,7 @@
                 <w:sz w:val="16"/>
                 <w:szCs w:val="16"/>
               </w:rPr>
-              <w:t xml:space="preserve">AI only</w:t>
+              <w:t xml:space="preserve">Any</w:t>
             </w:r>
           </w:p>
         </w:tc>
@@ -18246,7 +18113,7 @@
                 <w:sz w:val="16"/>
                 <w:szCs w:val="16"/>
               </w:rPr>
-              <w:t xml:space="preserve">1.9% (111/5,985)</w:t>
+              <w:t xml:space="preserve">2.0% (181/8,880)</w:t>
             </w:r>
           </w:p>
         </w:tc>
@@ -18279,7 +18146,7 @@
                 <w:sz w:val="16"/>
                 <w:szCs w:val="16"/>
               </w:rPr>
-              <w:t xml:space="preserve">1.19 (0.96, 1.47)</w:t>
+              <w:t xml:space="preserve">1.25 (1.06, 1.47)</w:t>
             </w:r>
           </w:p>
         </w:tc>
@@ -18312,7 +18179,7 @@
                 <w:sz w:val="16"/>
                 <w:szCs w:val="16"/>
               </w:rPr>
-              <w:t xml:space="preserve">1.07 (0.86, 1.32)</w:t>
+              <w:t xml:space="preserve">1.14 (0.96, 1.35)</w:t>
             </w:r>
           </w:p>
         </w:tc>
@@ -18345,7 +18212,7 @@
                 <w:sz w:val="16"/>
                 <w:szCs w:val="16"/>
               </w:rPr>
-              <w:t xml:space="preserve">1.11 (0.90, 1.37)</w:t>
+              <w:t xml:space="preserve">1.20 (1.02, 1.42)</w:t>
             </w:r>
           </w:p>
         </w:tc>
@@ -18384,7 +18251,7 @@
                 <w:sz w:val="16"/>
                 <w:szCs w:val="16"/>
               </w:rPr>
-              <w:t xml:space="preserve">Both MVM and AI</w:t>
+              <w:t xml:space="preserve">Score, per 1 compartment</w:t>
             </w:r>
           </w:p>
         </w:tc>
@@ -18417,7 +18284,7 @@
                 <w:sz w:val="16"/>
                 <w:szCs w:val="16"/>
               </w:rPr>
-              <w:t xml:space="preserve">2.4% (70/2,895)</w:t>
+              <w:t xml:space="preserve"/>
             </w:r>
           </w:p>
         </w:tc>
@@ -18450,7 +18317,7 @@
                 <w:sz w:val="16"/>
                 <w:szCs w:val="16"/>
               </w:rPr>
-              <w:t xml:space="preserve">1.55 (1.20, 1.99)</w:t>
+              <w:t xml:space="preserve">1.03 (0.98, 1.09)</w:t>
             </w:r>
           </w:p>
         </w:tc>
@@ -18483,7 +18350,7 @@
                 <w:sz w:val="16"/>
                 <w:szCs w:val="16"/>
               </w:rPr>
-              <w:t xml:space="preserve">1.37 (1.05, 1.78)</w:t>
+              <w:t xml:space="preserve">1.03 (0.98, 1.08)</w:t>
             </w:r>
           </w:p>
         </w:tc>
@@ -18516,7 +18383,7 @@
                 <w:sz w:val="16"/>
                 <w:szCs w:val="16"/>
               </w:rPr>
-              <w:t xml:space="preserve">1.57 (1.22, 2.02)</w:t>
+              <w:t xml:space="preserve">1.04 (0.99, 1.09)</w:t>
             </w:r>
           </w:p>
         </w:tc>

</xml_diff>